<commit_message>
Update process report and BPMN models
</commit_message>
<xml_diff>
--- a/01.WORKING_SPACE/3.DangVanHau-25410203/quytrinhquanlitrahang_v2.docx
+++ b/01.WORKING_SPACE/3.DangVanHau-25410203/quytrinhquanlitrahang_v2.docx
@@ -49,6 +49,12 @@
     <w:p>
       <w:pPr>
         <w:spacing w:before="120" w:after="80"/>
+        <w:rPr>
+          <w:rFonts w:ascii="Times New Roman" w:hAnsi="Times New Roman"/>
+          <w:b/>
+          <w:color w:val="000000"/>
+          <w:sz w:val="26"/>
+        </w:rPr>
       </w:pPr>
       <w:r>
         <w:rPr>
@@ -58,6 +64,80 @@
           <w:sz w:val="26"/>
         </w:rPr>
         <w:t>Kiến trúc quy trình</w:t>
+      </w:r>
+    </w:p>
+    <w:p>
+      <w:pPr>
+        <w:spacing w:before="120" w:after="80"/>
+      </w:pPr>
+      <w:r>
+        <w:rPr>
+          <w:noProof/>
+        </w:rPr>
+        <w:drawing>
+          <wp:inline distT="0" distB="0" distL="0" distR="0" wp14:anchorId="1BAFBECF" wp14:editId="47F35A2D">
+            <wp:extent cx="5943600" cy="1039495"/>
+            <wp:effectExtent l="0" t="0" r="0" b="8255"/>
+            <wp:docPr id="207589191" name="Picture 1"/>
+            <wp:cNvGraphicFramePr>
+              <a:graphicFrameLocks xmlns:a="http://schemas.openxmlformats.org/drawingml/2006/main" noChangeAspect="1"/>
+            </wp:cNvGraphicFramePr>
+            <a:graphic xmlns:a="http://schemas.openxmlformats.org/drawingml/2006/main">
+              <a:graphicData uri="http://schemas.openxmlformats.org/drawingml/2006/picture">
+                <pic:pic xmlns:pic="http://schemas.openxmlformats.org/drawingml/2006/picture">
+                  <pic:nvPicPr>
+                    <pic:cNvPr id="0" name="Picture 1"/>
+                    <pic:cNvPicPr>
+                      <a:picLocks noChangeAspect="1" noChangeArrowheads="1"/>
+                    </pic:cNvPicPr>
+                  </pic:nvPicPr>
+                  <pic:blipFill>
+                    <a:blip r:embed="rId6">
+                      <a:extLst>
+                        <a:ext uri="{28A0092B-C50C-407E-A947-70E740481C1C}">
+                          <a14:useLocalDpi xmlns:a14="http://schemas.microsoft.com/office/drawing/2010/main" val="0"/>
+                        </a:ext>
+                      </a:extLst>
+                    </a:blip>
+                    <a:srcRect/>
+                    <a:stretch>
+                      <a:fillRect/>
+                    </a:stretch>
+                  </pic:blipFill>
+                  <pic:spPr bwMode="auto">
+                    <a:xfrm>
+                      <a:off x="0" y="0"/>
+                      <a:ext cx="5943600" cy="1039495"/>
+                    </a:xfrm>
+                    <a:prstGeom prst="rect">
+                      <a:avLst/>
+                    </a:prstGeom>
+                    <a:noFill/>
+                    <a:ln>
+                      <a:noFill/>
+                    </a:ln>
+                  </pic:spPr>
+                </pic:pic>
+              </a:graphicData>
+            </a:graphic>
+          </wp:inline>
+        </w:drawing>
+      </w:r>
+    </w:p>
+    <w:p>
+      <w:pPr>
+        <w:spacing w:before="40"/>
+        <w:jc w:val="center"/>
+      </w:pPr>
+      <w:r>
+        <w:rPr>
+          <w:rFonts w:ascii="Times New Roman" w:hAnsi="Times New Roman"/>
+          <w:b/>
+          <w:i/>
+          <w:color w:val="000000"/>
+          <w:sz w:val="20"/>
+        </w:rPr>
+        <w:t>Hình 3.8.0: Sơ đồ Kiến trúc quy trình Quản lý hoàn trả hàng &amp; CSKH Viettel Post</w:t>
       </w:r>
     </w:p>
     <w:p>
@@ -248,15 +328,12 @@
         <w:spacing w:before="40" w:after="80"/>
       </w:pPr>
       <w:r>
-        <w:rPr>
-          <w:noProof/>
-        </w:rPr>
         <w:lastRenderedPageBreak/>
         <w:drawing>
-          <wp:inline distT="0" distB="0" distL="0" distR="0" wp14:anchorId="2DA75523" wp14:editId="15BB2F80">
-            <wp:extent cx="5943600" cy="2655570"/>
-            <wp:effectExtent l="0" t="0" r="0" b="0"/>
-            <wp:docPr id="2050968786" name="Picture 1"/>
+          <wp:inline distT="0" distB="0" distL="0" distR="0" wp14:anchorId="7CB5E1D4" wp14:editId="47575707">
+            <wp:extent cx="5943600" cy="2605405"/>
+            <wp:effectExtent l="0" t="0" r="0" b="4445"/>
+            <wp:docPr id="458738003" name="Picture 1"/>
             <wp:cNvGraphicFramePr>
               <a:graphicFrameLocks xmlns:a="http://schemas.openxmlformats.org/drawingml/2006/main" noChangeAspect="1"/>
             </wp:cNvGraphicFramePr>
@@ -264,11 +341,11 @@
               <a:graphicData uri="http://schemas.openxmlformats.org/drawingml/2006/picture">
                 <pic:pic xmlns:pic="http://schemas.openxmlformats.org/drawingml/2006/picture">
                   <pic:nvPicPr>
-                    <pic:cNvPr id="2050968786" name=""/>
+                    <pic:cNvPr id="458738003" name=""/>
                     <pic:cNvPicPr/>
                   </pic:nvPicPr>
                   <pic:blipFill>
-                    <a:blip r:embed="rId6"/>
+                    <a:blip r:embed="rId7"/>
                     <a:stretch>
                       <a:fillRect/>
                     </a:stretch>
@@ -276,7 +353,7 @@
                   <pic:spPr>
                     <a:xfrm>
                       <a:off x="0" y="0"/>
-                      <a:ext cx="5943600" cy="2655570"/>
+                      <a:ext cx="5943600" cy="2605405"/>
                     </a:xfrm>
                     <a:prstGeom prst="rect">
                       <a:avLst/>
@@ -322,6 +399,9 @@
     <w:p>
       <w:pPr>
         <w:spacing w:before="40" w:after="80"/>
+        <w:rPr>
+          <w:bCs/>
+        </w:rPr>
       </w:pPr>
       <w:r>
         <w:rPr>
@@ -329,7 +409,15 @@
           <w:b/>
           <w:color w:val="000000"/>
         </w:rPr>
-        <w:t>Các tác nhân tham gia: Pool Khách hàng (tác nhân khởi tạo); Pool Viettel Post bao gồm 4 Lanes nội bộ: (1) Bộ phận CSKH, (2) Shipper, (3) Bưu cục / Kho, (4) Hệ thống quản lý CNTT; Pool Người nhận / Người gửi (đối tượng nhận hàng hoàn hoặc kết quả đền bù).</w:t>
+        <w:t xml:space="preserve">Các tác nhân tham gia: </w:t>
+      </w:r>
+      <w:r>
+        <w:rPr>
+          <w:rFonts w:ascii="Times New Roman" w:hAnsi="Times New Roman"/>
+          <w:bCs/>
+          <w:color w:val="000000"/>
+        </w:rPr>
+        <w:t>Pool Khách hàng (tác nhân khởi tạo); Pool Viettel Post bao gồm 4 Lanes nội bộ: (1) Bộ phận CSKH, (2) Shipper, (3) Bưu cục / Kho, (4) Hệ thống quản lý CNTT; Pool Người nhận / Người gửi (đối tượng nhận hàng hoàn hoặc kết quả đền bù).</w:t>
       </w:r>
     </w:p>
     <w:p>
@@ -342,12 +430,23 @@
           <w:b/>
           <w:color w:val="000000"/>
         </w:rPr>
-        <w:t>Giá trị mang lại: Tối ưu thời gian giải quyết khiếu nại, đảm bảo tính chính xác trong khâu thu hồi hàng hoàn, bảo vệ quyền lợi tài chính cho khách hàng và phòng ngừa gian lận cho doanh nghiệp.</w:t>
+        <w:t xml:space="preserve">Giá trị mang lại: </w:t>
+      </w:r>
+      <w:r>
+        <w:rPr>
+          <w:rFonts w:ascii="Times New Roman" w:hAnsi="Times New Roman"/>
+          <w:bCs/>
+          <w:color w:val="000000"/>
+        </w:rPr>
+        <w:t>Tối ưu thời gian giải quyết khiếu nại, đảm bảo tính chính xác trong khâu thu hồi hàng hoàn, bảo vệ quyền lợi tài chính cho khách hàng và phòng ngừa gian lận cho doanh nghiệp.</w:t>
       </w:r>
     </w:p>
     <w:p>
       <w:pPr>
         <w:spacing w:before="40" w:after="80"/>
+        <w:rPr>
+          <w:bCs/>
+        </w:rPr>
       </w:pPr>
       <w:r>
         <w:rPr>
@@ -355,7 +454,15 @@
           <w:b/>
           <w:color w:val="000000"/>
         </w:rPr>
-        <w:t>Kết quả có thể xảy ra: (1) Hoàn trả hàng thành công về người gửi; (2) Giải quyết khiếu nại đền bù thỏa đáng; (3) Tư vấn giải đáp thành công; (4) Lập biên bản từ chối hoàn trả do không đủ điều kiện.</w:t>
+        <w:t xml:space="preserve">Kết quả có thể xảy ra: </w:t>
+      </w:r>
+      <w:r>
+        <w:rPr>
+          <w:rFonts w:ascii="Times New Roman" w:hAnsi="Times New Roman"/>
+          <w:bCs/>
+          <w:color w:val="000000"/>
+        </w:rPr>
+        <w:t>(1) Hoàn trả hàng thành công về người gửi; (2) Giải quyết khiếu nại đền bù thỏa đáng; (3) Tư vấn giải đáp thành công; (4) Lập biên bản từ chối hoàn trả do không đủ điều kiện.</w:t>
       </w:r>
     </w:p>
     <w:p>
@@ -397,6 +504,12 @@
         </w:rPr>
         <w:t>Đánh giá và phân loại 17 bước công việc trong quy trình thành 3 nhóm giá trị: VA (Tạo giá trị cho khách hàng), BVA (Cần thiết cho quản lý và tuân thủ), NVA (Lãng phí, di chuyển hoặc làm lại).</w:t>
       </w:r>
+    </w:p>
+    <w:p>
+      <w:pPr>
+        <w:spacing w:before="40"/>
+        <w:jc w:val="center"/>
+      </w:pPr>
     </w:p>
     <w:tbl>
       <w:tblPr>
@@ -2814,82 +2927,6 @@
                 <pic:pic xmlns:pic="http://schemas.openxmlformats.org/drawingml/2006/picture">
                   <pic:nvPicPr>
                     <pic:cNvPr id="0" name="why_why_1.png"/>
-                    <pic:cNvPicPr/>
-                  </pic:nvPicPr>
-                  <pic:blipFill>
-                    <a:blip r:embed="rId7"/>
-                    <a:stretch>
-                      <a:fillRect/>
-                    </a:stretch>
-                  </pic:blipFill>
-                  <pic:spPr>
-                    <a:xfrm>
-                      <a:off x="0" y="0"/>
-                      <a:ext cx="5303520" cy="2828544"/>
-                    </a:xfrm>
-                    <a:prstGeom prst="rect">
-                      <a:avLst/>
-                    </a:prstGeom>
-                  </pic:spPr>
-                </pic:pic>
-              </a:graphicData>
-            </a:graphic>
-          </wp:inline>
-        </w:drawing>
-      </w:r>
-    </w:p>
-    <w:p>
-      <w:pPr>
-        <w:spacing w:before="40" w:after="160"/>
-        <w:jc w:val="center"/>
-      </w:pPr>
-      <w:r>
-        <w:rPr>
-          <w:rFonts w:ascii="Times New Roman" w:hAnsi="Times New Roman"/>
-          <w:b/>
-          <w:i/>
-          <w:color w:val="000000"/>
-          <w:sz w:val="20"/>
-        </w:rPr>
-        <w:t>Hình 1. Sơ đồ Why-Why — thời gian chờ đối soát giữa CSKH và Kho</w:t>
-      </w:r>
-    </w:p>
-    <w:p>
-      <w:pPr>
-        <w:spacing w:before="120" w:after="60"/>
-      </w:pPr>
-      <w:r>
-        <w:rPr>
-          <w:rFonts w:ascii="Times New Roman" w:hAnsi="Times New Roman"/>
-          <w:b/>
-          <w:i/>
-          <w:color w:val="000000"/>
-        </w:rPr>
-        <w:t>Sai sót chứng từ đơn hoàn phải nộp bổ sung</w:t>
-      </w:r>
-    </w:p>
-    <w:p>
-      <w:pPr>
-        <w:spacing w:before="80" w:after="40"/>
-        <w:jc w:val="center"/>
-      </w:pPr>
-      <w:r>
-        <w:rPr>
-          <w:noProof/>
-        </w:rPr>
-        <w:drawing>
-          <wp:inline distT="0" distB="0" distL="0" distR="0" wp14:anchorId="17810FB3" wp14:editId="4D43FE26">
-            <wp:extent cx="5303520" cy="2828544"/>
-            <wp:effectExtent l="0" t="0" r="0" b="0"/>
-            <wp:docPr id="2" name="Picture 2"/>
-            <wp:cNvGraphicFramePr>
-              <a:graphicFrameLocks xmlns:a="http://schemas.openxmlformats.org/drawingml/2006/main" noChangeAspect="1"/>
-            </wp:cNvGraphicFramePr>
-            <a:graphic xmlns:a="http://schemas.openxmlformats.org/drawingml/2006/main">
-              <a:graphicData uri="http://schemas.openxmlformats.org/drawingml/2006/picture">
-                <pic:pic xmlns:pic="http://schemas.openxmlformats.org/drawingml/2006/picture">
-                  <pic:nvPicPr>
-                    <pic:cNvPr id="0" name="why_why_2.png"/>
                     <pic:cNvPicPr/>
                   </pic:nvPicPr>
                   <pic:blipFill>
@@ -2927,7 +2964,7 @@
           <w:color w:val="000000"/>
           <w:sz w:val="20"/>
         </w:rPr>
-        <w:t>Hình 2. Sơ đồ Why-Why — sai sót chứng từ đơn hoàn</w:t>
+        <w:t>Hình 1. Sơ đồ Why-Why — thời gian chờ đối soát giữa CSKH và Kho</w:t>
       </w:r>
     </w:p>
     <w:p>
@@ -2941,7 +2978,7 @@
           <w:i/>
           <w:color w:val="000000"/>
         </w:rPr>
-        <w:t>Hàng hoàn tồn đọng tại kho chờ duyệt biên bản</w:t>
+        <w:t>Sai sót chứng từ đơn hoàn phải nộp bổ sung</w:t>
       </w:r>
     </w:p>
     <w:p>
@@ -2953,12 +2990,11 @@
         <w:rPr>
           <w:noProof/>
         </w:rPr>
-        <w:lastRenderedPageBreak/>
         <w:drawing>
-          <wp:inline distT="0" distB="0" distL="0" distR="0" wp14:anchorId="4479D384" wp14:editId="10B45562">
+          <wp:inline distT="0" distB="0" distL="0" distR="0" wp14:anchorId="17810FB3" wp14:editId="4D43FE26">
             <wp:extent cx="5303520" cy="2828544"/>
             <wp:effectExtent l="0" t="0" r="0" b="0"/>
-            <wp:docPr id="3" name="Picture 3"/>
+            <wp:docPr id="2" name="Picture 2"/>
             <wp:cNvGraphicFramePr>
               <a:graphicFrameLocks xmlns:a="http://schemas.openxmlformats.org/drawingml/2006/main" noChangeAspect="1"/>
             </wp:cNvGraphicFramePr>
@@ -2966,7 +3002,7 @@
               <a:graphicData uri="http://schemas.openxmlformats.org/drawingml/2006/picture">
                 <pic:pic xmlns:pic="http://schemas.openxmlformats.org/drawingml/2006/picture">
                   <pic:nvPicPr>
-                    <pic:cNvPr id="0" name="why_why_3.png"/>
+                    <pic:cNvPr id="0" name="why_why_2.png"/>
                     <pic:cNvPicPr/>
                   </pic:nvPicPr>
                   <pic:blipFill>
@@ -3004,7 +3040,7 @@
           <w:color w:val="000000"/>
           <w:sz w:val="20"/>
         </w:rPr>
-        <w:t>Hình 3. Sơ đồ Why-Why — hàng hoàn tồn đọng lưu kho</w:t>
+        <w:t>Hình 2. Sơ đồ Why-Why — sai sót chứng từ đơn hoàn</w:t>
       </w:r>
     </w:p>
     <w:p>
@@ -3018,7 +3054,7 @@
           <w:i/>
           <w:color w:val="000000"/>
         </w:rPr>
-        <w:t>Shipper di chuyển nhiều lần do khách vắng nhà</w:t>
+        <w:t>Hàng hoàn tồn đọng tại kho chờ duyệt biên bản</w:t>
       </w:r>
     </w:p>
     <w:p>
@@ -3030,11 +3066,12 @@
         <w:rPr>
           <w:noProof/>
         </w:rPr>
+        <w:lastRenderedPageBreak/>
         <w:drawing>
-          <wp:inline distT="0" distB="0" distL="0" distR="0" wp14:anchorId="713C4FB0" wp14:editId="31CA10E5">
+          <wp:inline distT="0" distB="0" distL="0" distR="0" wp14:anchorId="4479D384" wp14:editId="10B45562">
             <wp:extent cx="5303520" cy="2828544"/>
             <wp:effectExtent l="0" t="0" r="0" b="0"/>
-            <wp:docPr id="4" name="Picture 4"/>
+            <wp:docPr id="3" name="Picture 3"/>
             <wp:cNvGraphicFramePr>
               <a:graphicFrameLocks xmlns:a="http://schemas.openxmlformats.org/drawingml/2006/main" noChangeAspect="1"/>
             </wp:cNvGraphicFramePr>
@@ -3042,7 +3079,7 @@
               <a:graphicData uri="http://schemas.openxmlformats.org/drawingml/2006/picture">
                 <pic:pic xmlns:pic="http://schemas.openxmlformats.org/drawingml/2006/picture">
                   <pic:nvPicPr>
-                    <pic:cNvPr id="0" name="why_why_4.png"/>
+                    <pic:cNvPr id="0" name="why_why_3.png"/>
                     <pic:cNvPicPr/>
                   </pic:nvPicPr>
                   <pic:blipFill>
@@ -3080,7 +3117,7 @@
           <w:color w:val="000000"/>
           <w:sz w:val="20"/>
         </w:rPr>
-        <w:t>Hình 4. Sơ đồ Why-Why — Shipper di chuyển lặp lại</w:t>
+        <w:t>Hình 3. Sơ đồ Why-Why — hàng hoàn tồn đọng lưu kho</w:t>
       </w:r>
     </w:p>
     <w:p>
@@ -3094,7 +3131,7 @@
           <w:i/>
           <w:color w:val="000000"/>
         </w:rPr>
-        <w:t>Kiểm tra thông tin đơn hàng lặp lại ở CSKH và Kho</w:t>
+        <w:t>Shipper di chuyển nhiều lần do khách vắng nhà</w:t>
       </w:r>
     </w:p>
     <w:p>
@@ -3106,12 +3143,11 @@
         <w:rPr>
           <w:noProof/>
         </w:rPr>
-        <w:lastRenderedPageBreak/>
         <w:drawing>
-          <wp:inline distT="0" distB="0" distL="0" distR="0" wp14:anchorId="2FF6E1B5" wp14:editId="2D3D9F4B">
+          <wp:inline distT="0" distB="0" distL="0" distR="0" wp14:anchorId="713C4FB0" wp14:editId="31CA10E5">
             <wp:extent cx="5303520" cy="2828544"/>
             <wp:effectExtent l="0" t="0" r="0" b="0"/>
-            <wp:docPr id="5" name="Picture 5"/>
+            <wp:docPr id="4" name="Picture 4"/>
             <wp:cNvGraphicFramePr>
               <a:graphicFrameLocks xmlns:a="http://schemas.openxmlformats.org/drawingml/2006/main" noChangeAspect="1"/>
             </wp:cNvGraphicFramePr>
@@ -3119,7 +3155,7 @@
               <a:graphicData uri="http://schemas.openxmlformats.org/drawingml/2006/picture">
                 <pic:pic xmlns:pic="http://schemas.openxmlformats.org/drawingml/2006/picture">
                   <pic:nvPicPr>
-                    <pic:cNvPr id="0" name="why_why_5.png"/>
+                    <pic:cNvPr id="0" name="why_why_4.png"/>
                     <pic:cNvPicPr/>
                   </pic:nvPicPr>
                   <pic:blipFill>
@@ -3157,6 +3193,83 @@
           <w:color w:val="000000"/>
           <w:sz w:val="20"/>
         </w:rPr>
+        <w:t>Hình 4. Sơ đồ Why-Why — Shipper di chuyển lặp lại</w:t>
+      </w:r>
+    </w:p>
+    <w:p>
+      <w:pPr>
+        <w:spacing w:before="120" w:after="60"/>
+      </w:pPr>
+      <w:r>
+        <w:rPr>
+          <w:rFonts w:ascii="Times New Roman" w:hAnsi="Times New Roman"/>
+          <w:b/>
+          <w:i/>
+          <w:color w:val="000000"/>
+        </w:rPr>
+        <w:t>Kiểm tra thông tin đơn hàng lặp lại ở CSKH và Kho</w:t>
+      </w:r>
+    </w:p>
+    <w:p>
+      <w:pPr>
+        <w:spacing w:before="80" w:after="40"/>
+        <w:jc w:val="center"/>
+      </w:pPr>
+      <w:r>
+        <w:rPr>
+          <w:noProof/>
+        </w:rPr>
+        <w:lastRenderedPageBreak/>
+        <w:drawing>
+          <wp:inline distT="0" distB="0" distL="0" distR="0" wp14:anchorId="2FF6E1B5" wp14:editId="2D3D9F4B">
+            <wp:extent cx="5303520" cy="2828544"/>
+            <wp:effectExtent l="0" t="0" r="0" b="0"/>
+            <wp:docPr id="5" name="Picture 5"/>
+            <wp:cNvGraphicFramePr>
+              <a:graphicFrameLocks xmlns:a="http://schemas.openxmlformats.org/drawingml/2006/main" noChangeAspect="1"/>
+            </wp:cNvGraphicFramePr>
+            <a:graphic xmlns:a="http://schemas.openxmlformats.org/drawingml/2006/main">
+              <a:graphicData uri="http://schemas.openxmlformats.org/drawingml/2006/picture">
+                <pic:pic xmlns:pic="http://schemas.openxmlformats.org/drawingml/2006/picture">
+                  <pic:nvPicPr>
+                    <pic:cNvPr id="0" name="why_why_5.png"/>
+                    <pic:cNvPicPr/>
+                  </pic:nvPicPr>
+                  <pic:blipFill>
+                    <a:blip r:embed="rId12"/>
+                    <a:stretch>
+                      <a:fillRect/>
+                    </a:stretch>
+                  </pic:blipFill>
+                  <pic:spPr>
+                    <a:xfrm>
+                      <a:off x="0" y="0"/>
+                      <a:ext cx="5303520" cy="2828544"/>
+                    </a:xfrm>
+                    <a:prstGeom prst="rect">
+                      <a:avLst/>
+                    </a:prstGeom>
+                  </pic:spPr>
+                </pic:pic>
+              </a:graphicData>
+            </a:graphic>
+          </wp:inline>
+        </w:drawing>
+      </w:r>
+    </w:p>
+    <w:p>
+      <w:pPr>
+        <w:spacing w:before="40" w:after="160"/>
+        <w:jc w:val="center"/>
+      </w:pPr>
+      <w:r>
+        <w:rPr>
+          <w:rFonts w:ascii="Times New Roman" w:hAnsi="Times New Roman"/>
+          <w:b/>
+          <w:i/>
+          <w:color w:val="000000"/>
+          <w:sz w:val="20"/>
+        </w:rPr>
         <w:t>Hình 5. Sơ đồ Why-Why — kiểm tra dữ liệu lặp lại</w:t>
       </w:r>
     </w:p>
@@ -4875,7 +4988,23 @@
                 <w:rFonts w:ascii="Times New Roman" w:hAnsi="Times New Roman"/>
                 <w:color w:val="000000"/>
               </w:rPr>
-              <w:t>20% (Nhánh K.Nại)</w:t>
+              <w:t xml:space="preserve">20% (Nhánh </w:t>
+            </w:r>
+            <w:proofErr w:type="gramStart"/>
+            <w:r>
+              <w:rPr>
+                <w:rFonts w:ascii="Times New Roman" w:hAnsi="Times New Roman"/>
+                <w:color w:val="000000"/>
+              </w:rPr>
+              <w:t>K.Nại</w:t>
+            </w:r>
+            <w:proofErr w:type="gramEnd"/>
+            <w:r>
+              <w:rPr>
+                <w:rFonts w:ascii="Times New Roman" w:hAnsi="Times New Roman"/>
+                <w:color w:val="000000"/>
+              </w:rPr>
+              <w:t>)</w:t>
             </w:r>
           </w:p>
         </w:tc>
@@ -5327,7 +5456,23 @@
           <w:rFonts w:ascii="Times New Roman" w:hAnsi="Times New Roman"/>
           <w:color w:val="000000"/>
         </w:rPr>
-        <w:t>T_proc(Block 1) = (5 + 3 + 5 + 0.20 * 10) / (1 - 0.20) = 15 / 0.80 = 18,75 phút.</w:t>
+        <w:t>T_</w:t>
+      </w:r>
+      <w:proofErr w:type="gramStart"/>
+      <w:r>
+        <w:rPr>
+          <w:rFonts w:ascii="Times New Roman" w:hAnsi="Times New Roman"/>
+          <w:color w:val="000000"/>
+        </w:rPr>
+        <w:t>proc(</w:t>
+      </w:r>
+      <w:proofErr w:type="gramEnd"/>
+      <w:r>
+        <w:rPr>
+          <w:rFonts w:ascii="Times New Roman" w:hAnsi="Times New Roman"/>
+          <w:color w:val="000000"/>
+        </w:rPr>
+        <w:t>Block 1) = (5 + 3 + 5 + 0.20 * 10) / (1 - 0.20) = 15 / 0.80 = 18,75 phút.</w:t>
       </w:r>
     </w:p>
     <w:p>
@@ -5348,7 +5493,23 @@
           <w:rFonts w:ascii="Times New Roman" w:hAnsi="Times New Roman"/>
           <w:color w:val="000000"/>
         </w:rPr>
-        <w:t>T_cycle(Block 1) = (5 + 18 + 15 + 0.20 * 130) / (1 - 0.20) = 64 / 0.80 = 80,00 phút.</w:t>
+        <w:t>T_</w:t>
+      </w:r>
+      <w:proofErr w:type="gramStart"/>
+      <w:r>
+        <w:rPr>
+          <w:rFonts w:ascii="Times New Roman" w:hAnsi="Times New Roman"/>
+          <w:color w:val="000000"/>
+        </w:rPr>
+        <w:t>cycle(</w:t>
+      </w:r>
+      <w:proofErr w:type="gramEnd"/>
+      <w:r>
+        <w:rPr>
+          <w:rFonts w:ascii="Times New Roman" w:hAnsi="Times New Roman"/>
+          <w:color w:val="000000"/>
+        </w:rPr>
+        <w:t>Block 1) = (5 + 18 + 15 + 0.20 * 130) / (1 - 0.20) = 64 / 0.80 = 80,00 phút.</w:t>
       </w:r>
     </w:p>
     <w:p>
@@ -5381,7 +5542,23 @@
           <w:rFonts w:ascii="Times New Roman" w:hAnsi="Times New Roman"/>
           <w:color w:val="000000"/>
         </w:rPr>
-        <w:t>T_proc(Block 2) = 15 + 3 = 18,00 phút.</w:t>
+        <w:t>T_</w:t>
+      </w:r>
+      <w:proofErr w:type="gramStart"/>
+      <w:r>
+        <w:rPr>
+          <w:rFonts w:ascii="Times New Roman" w:hAnsi="Times New Roman"/>
+          <w:color w:val="000000"/>
+        </w:rPr>
+        <w:t>proc(</w:t>
+      </w:r>
+      <w:proofErr w:type="gramEnd"/>
+      <w:r>
+        <w:rPr>
+          <w:rFonts w:ascii="Times New Roman" w:hAnsi="Times New Roman"/>
+          <w:color w:val="000000"/>
+        </w:rPr>
+        <w:t>Block 2) = 15 + 3 = 18,00 phút.</w:t>
       </w:r>
     </w:p>
     <w:p>
@@ -5402,7 +5579,23 @@
           <w:rFonts w:ascii="Times New Roman" w:hAnsi="Times New Roman"/>
           <w:color w:val="000000"/>
         </w:rPr>
-        <w:t>T_cycle(Block 2) = 75 + 8 = 83,00 phút.</w:t>
+        <w:t>T_</w:t>
+      </w:r>
+      <w:proofErr w:type="gramStart"/>
+      <w:r>
+        <w:rPr>
+          <w:rFonts w:ascii="Times New Roman" w:hAnsi="Times New Roman"/>
+          <w:color w:val="000000"/>
+        </w:rPr>
+        <w:t>cycle(</w:t>
+      </w:r>
+      <w:proofErr w:type="gramEnd"/>
+      <w:r>
+        <w:rPr>
+          <w:rFonts w:ascii="Times New Roman" w:hAnsi="Times New Roman"/>
+          <w:color w:val="000000"/>
+        </w:rPr>
+        <w:t>Block 2) = 75 + 8 = 83,00 phút.</w:t>
       </w:r>
     </w:p>
     <w:p>
@@ -5498,7 +5691,23 @@
           <w:rFonts w:ascii="Times New Roman" w:hAnsi="Times New Roman"/>
           <w:color w:val="000000"/>
         </w:rPr>
-        <w:t>T_proc(Block 3) = 0.70 * 86.25 + 0.20 * 15 + 0.10 * 10 = 64,38 phút.</w:t>
+        <w:t>T_</w:t>
+      </w:r>
+      <w:proofErr w:type="gramStart"/>
+      <w:r>
+        <w:rPr>
+          <w:rFonts w:ascii="Times New Roman" w:hAnsi="Times New Roman"/>
+          <w:color w:val="000000"/>
+        </w:rPr>
+        <w:t>proc(</w:t>
+      </w:r>
+      <w:proofErr w:type="gramEnd"/>
+      <w:r>
+        <w:rPr>
+          <w:rFonts w:ascii="Times New Roman" w:hAnsi="Times New Roman"/>
+          <w:color w:val="000000"/>
+        </w:rPr>
+        <w:t>Block 3) = 0.70 * 86.25 + 0.20 * 15 + 0.10 * 10 = 64,38 phút.</w:t>
       </w:r>
     </w:p>
     <w:p>
@@ -5519,7 +5728,23 @@
           <w:rFonts w:ascii="Times New Roman" w:hAnsi="Times New Roman"/>
           <w:color w:val="000000"/>
         </w:rPr>
-        <w:t>T_cycle(Block 3) = 0.70 * 251.75 + 0.20 * 105 + 0.10 * 20 = 199,23 phút.</w:t>
+        <w:t>T_</w:t>
+      </w:r>
+      <w:proofErr w:type="gramStart"/>
+      <w:r>
+        <w:rPr>
+          <w:rFonts w:ascii="Times New Roman" w:hAnsi="Times New Roman"/>
+          <w:color w:val="000000"/>
+        </w:rPr>
+        <w:t>cycle(</w:t>
+      </w:r>
+      <w:proofErr w:type="gramEnd"/>
+      <w:r>
+        <w:rPr>
+          <w:rFonts w:ascii="Times New Roman" w:hAnsi="Times New Roman"/>
+          <w:color w:val="000000"/>
+        </w:rPr>
+        <w:t>Block 3) = 0.70 * 251.75 + 0.20 * 105 + 0.10 * 20 = 199,23 phút.</w:t>
       </w:r>
     </w:p>
     <w:p>
@@ -5552,7 +5777,23 @@
           <w:rFonts w:ascii="Times New Roman" w:hAnsi="Times New Roman"/>
           <w:color w:val="000000"/>
         </w:rPr>
-        <w:t>T_proc(Block 4) = 5 + 5 + 3 = 13,00 phút.</w:t>
+        <w:t>T_</w:t>
+      </w:r>
+      <w:proofErr w:type="gramStart"/>
+      <w:r>
+        <w:rPr>
+          <w:rFonts w:ascii="Times New Roman" w:hAnsi="Times New Roman"/>
+          <w:color w:val="000000"/>
+        </w:rPr>
+        <w:t>proc(</w:t>
+      </w:r>
+      <w:proofErr w:type="gramEnd"/>
+      <w:r>
+        <w:rPr>
+          <w:rFonts w:ascii="Times New Roman" w:hAnsi="Times New Roman"/>
+          <w:color w:val="000000"/>
+        </w:rPr>
+        <w:t>Block 4) = 5 + 5 + 3 = 13,00 phút.</w:t>
       </w:r>
     </w:p>
     <w:p>
@@ -5573,7 +5814,23 @@
           <w:rFonts w:ascii="Times New Roman" w:hAnsi="Times New Roman"/>
           <w:color w:val="000000"/>
         </w:rPr>
-        <w:t>T_cycle(Block 4) = 20 + 5 + 8 = 33,00 phút.</w:t>
+        <w:t>T_</w:t>
+      </w:r>
+      <w:proofErr w:type="gramStart"/>
+      <w:r>
+        <w:rPr>
+          <w:rFonts w:ascii="Times New Roman" w:hAnsi="Times New Roman"/>
+          <w:color w:val="000000"/>
+        </w:rPr>
+        <w:t>cycle(</w:t>
+      </w:r>
+      <w:proofErr w:type="gramEnd"/>
+      <w:r>
+        <w:rPr>
+          <w:rFonts w:ascii="Times New Roman" w:hAnsi="Times New Roman"/>
+          <w:color w:val="000000"/>
+        </w:rPr>
+        <w:t>Block 4) = 20 + 5 + 8 = 33,00 phút.</w:t>
       </w:r>
     </w:p>
     <w:p>
@@ -8421,6 +8678,7 @@
   <w:style w:type="character" w:default="1" w:styleId="DefaultParagraphFont">
     <w:name w:val="Default Paragraph Font"/>
     <w:uiPriority w:val="1"/>
+    <w:semiHidden/>
     <w:unhideWhenUsed/>
   </w:style>
   <w:style w:type="table" w:default="1" w:styleId="TableNormal">

</xml_diff>

<commit_message>
docs : update doc
</commit_message>
<xml_diff>
--- a/01.WORKING_SPACE/3.DangVanHau-25410203/quytrinhquanlitrahang_v2.docx
+++ b/01.WORKING_SPACE/3.DangVanHau-25410203/quytrinhquanlitrahang_v2.docx
@@ -382,6 +382,4054 @@
         <w:t>[Hình 3.8.1: Sơ đồ BPMN quy trình Quản lý hoàn trả hàng &amp; CSKH Viettel Post]</w:t>
       </w:r>
     </w:p>
+    <w:tbl>
+      <w:tblPr>
+        <w:tblW w:type="auto" w:w="0"/>
+        <w:jc w:val="center"/>
+        <w:tblLook w:firstColumn="1" w:firstRow="1" w:lastColumn="0" w:lastRow="0" w:noHBand="0" w:noVBand="1" w:val="04A0"/>
+      </w:tblPr>
+      <w:tblGrid>
+        <w:gridCol w:w="2340"/>
+        <w:gridCol w:w="2340"/>
+        <w:gridCol w:w="2340"/>
+        <w:gridCol w:w="2340"/>
+      </w:tblGrid>
+      <w:tr>
+        <w:tc>
+          <w:tcPr>
+            <w:tcW w:type="dxa" w:w="720"/>
+            <w:shd w:fill="333333"/>
+          </w:tcPr>
+          <w:p>
+            <w:pPr>
+              <w:spacing w:before="60" w:after="60"/>
+              <w:jc w:val="center"/>
+            </w:pPr>
+            <w:r>
+              <w:rPr>
+                <w:rFonts w:ascii="Times New Roman" w:hAnsi="Times New Roman"/>
+                <w:b/>
+                <w:color w:val="FFFFFF"/>
+                <w:sz w:val="22"/>
+              </w:rPr>
+              <w:t>STT</w:t>
+            </w:r>
+          </w:p>
+        </w:tc>
+        <w:tc>
+          <w:tcPr>
+            <w:tcW w:type="dxa" w:w="1728"/>
+            <w:shd w:fill="333333"/>
+          </w:tcPr>
+          <w:p>
+            <w:pPr>
+              <w:spacing w:before="60" w:after="60"/>
+              <w:jc w:val="center"/>
+            </w:pPr>
+            <w:r>
+              <w:rPr>
+                <w:rFonts w:ascii="Times New Roman" w:hAnsi="Times New Roman"/>
+                <w:b/>
+                <w:color w:val="FFFFFF"/>
+                <w:sz w:val="22"/>
+              </w:rPr>
+              <w:t>Loại</w:t>
+            </w:r>
+          </w:p>
+        </w:tc>
+        <w:tc>
+          <w:tcPr>
+            <w:tcW w:type="dxa" w:w="5040"/>
+            <w:shd w:fill="333333"/>
+          </w:tcPr>
+          <w:p>
+            <w:pPr>
+              <w:spacing w:before="60" w:after="60"/>
+              <w:jc w:val="center"/>
+            </w:pPr>
+            <w:r>
+              <w:rPr>
+                <w:rFonts w:ascii="Times New Roman" w:hAnsi="Times New Roman"/>
+                <w:b/>
+                <w:color w:val="FFFFFF"/>
+                <w:sz w:val="22"/>
+              </w:rPr>
+              <w:t>Câu hỏi</w:t>
+            </w:r>
+          </w:p>
+        </w:tc>
+        <w:tc>
+          <w:tcPr>
+            <w:tcW w:type="dxa" w:w="1872"/>
+            <w:shd w:fill="333333"/>
+          </w:tcPr>
+          <w:p>
+            <w:pPr>
+              <w:spacing w:before="60" w:after="60"/>
+              <w:jc w:val="center"/>
+            </w:pPr>
+            <w:r>
+              <w:rPr>
+                <w:rFonts w:ascii="Times New Roman" w:hAnsi="Times New Roman"/>
+                <w:b/>
+                <w:color w:val="FFFFFF"/>
+                <w:sz w:val="22"/>
+              </w:rPr>
+              <w:t>Đối tượng</w:t>
+            </w:r>
+          </w:p>
+        </w:tc>
+      </w:tr>
+      <w:tr>
+        <w:tc>
+          <w:tcPr>
+            <w:tcW w:type="dxa" w:w="720"/>
+            <w:shd w:fill="FFFFFF"/>
+          </w:tcPr>
+          <w:p>
+            <w:pPr>
+              <w:spacing w:before="40" w:after="40"/>
+            </w:pPr>
+            <w:r>
+              <w:rPr>
+                <w:rFonts w:ascii="Times New Roman" w:hAnsi="Times New Roman"/>
+                <w:color w:val="000000"/>
+                <w:sz w:val="22"/>
+              </w:rPr>
+              <w:t>1</w:t>
+            </w:r>
+          </w:p>
+        </w:tc>
+        <w:tc>
+          <w:tcPr>
+            <w:tcW w:type="dxa" w:w="1728"/>
+            <w:shd w:fill="FFFFFF"/>
+          </w:tcPr>
+          <w:p>
+            <w:pPr>
+              <w:spacing w:before="40" w:after="40"/>
+            </w:pPr>
+            <w:r>
+              <w:rPr>
+                <w:rFonts w:ascii="Times New Roman" w:hAnsi="Times New Roman"/>
+                <w:color w:val="000000"/>
+                <w:sz w:val="22"/>
+              </w:rPr>
+              <w:t>Có cấu trúc</w:t>
+            </w:r>
+          </w:p>
+        </w:tc>
+        <w:tc>
+          <w:tcPr>
+            <w:tcW w:type="dxa" w:w="5040"/>
+            <w:shd w:fill="FFFFFF"/>
+          </w:tcPr>
+          <w:p>
+            <w:pPr>
+              <w:spacing w:before="40" w:after="40"/>
+            </w:pPr>
+            <w:r>
+              <w:rPr>
+                <w:rFonts w:ascii="Times New Roman" w:hAnsi="Times New Roman"/>
+                <w:color w:val="000000"/>
+                <w:sz w:val="22"/>
+              </w:rPr>
+              <w:t>Trung bình mỗi ngày bộ phận CSKH tiếp nhận bao nhiêu yêu cầu hoàn trả/khiếu nại? (đơn vị: đơn/ngày)</w:t>
+            </w:r>
+          </w:p>
+        </w:tc>
+        <w:tc>
+          <w:tcPr>
+            <w:tcW w:type="dxa" w:w="1872"/>
+            <w:shd w:fill="FFFFFF"/>
+          </w:tcPr>
+          <w:p>
+            <w:pPr>
+              <w:spacing w:before="40" w:after="40"/>
+            </w:pPr>
+            <w:r>
+              <w:rPr>
+                <w:rFonts w:ascii="Times New Roman" w:hAnsi="Times New Roman"/>
+                <w:color w:val="000000"/>
+                <w:sz w:val="22"/>
+              </w:rPr>
+              <w:t>CSKH</w:t>
+            </w:r>
+          </w:p>
+        </w:tc>
+      </w:tr>
+      <w:tr>
+        <w:tc>
+          <w:tcPr>
+            <w:tcW w:type="dxa" w:w="720"/>
+            <w:shd w:fill="F5F5F5"/>
+          </w:tcPr>
+          <w:p>
+            <w:pPr>
+              <w:spacing w:before="40" w:after="40"/>
+            </w:pPr>
+            <w:r>
+              <w:rPr>
+                <w:rFonts w:ascii="Times New Roman" w:hAnsi="Times New Roman"/>
+                <w:color w:val="000000"/>
+                <w:sz w:val="22"/>
+              </w:rPr>
+              <w:t>2</w:t>
+            </w:r>
+          </w:p>
+        </w:tc>
+        <w:tc>
+          <w:tcPr>
+            <w:tcW w:type="dxa" w:w="1728"/>
+            <w:shd w:fill="F5F5F5"/>
+          </w:tcPr>
+          <w:p>
+            <w:pPr>
+              <w:spacing w:before="40" w:after="40"/>
+            </w:pPr>
+            <w:r>
+              <w:rPr>
+                <w:rFonts w:ascii="Times New Roman" w:hAnsi="Times New Roman"/>
+                <w:color w:val="000000"/>
+                <w:sz w:val="22"/>
+              </w:rPr>
+              <w:t>Có cấu trúc</w:t>
+            </w:r>
+          </w:p>
+        </w:tc>
+        <w:tc>
+          <w:tcPr>
+            <w:tcW w:type="dxa" w:w="5040"/>
+            <w:shd w:fill="F5F5F5"/>
+          </w:tcPr>
+          <w:p>
+            <w:pPr>
+              <w:spacing w:before="40" w:after="40"/>
+            </w:pPr>
+            <w:r>
+              <w:rPr>
+                <w:rFonts w:ascii="Times New Roman" w:hAnsi="Times New Roman"/>
+                <w:color w:val="000000"/>
+                <w:sz w:val="22"/>
+              </w:rPr>
+              <w:t>Thời gian trung bình từ khi tiếp nhận yêu cầu đến khi xác minh xong nguyên nhân sự cố là bao lâu? (đơn vị: phút)</w:t>
+            </w:r>
+          </w:p>
+        </w:tc>
+        <w:tc>
+          <w:tcPr>
+            <w:tcW w:type="dxa" w:w="1872"/>
+            <w:shd w:fill="F5F5F5"/>
+          </w:tcPr>
+          <w:p>
+            <w:pPr>
+              <w:spacing w:before="40" w:after="40"/>
+            </w:pPr>
+            <w:r>
+              <w:rPr>
+                <w:rFonts w:ascii="Times New Roman" w:hAnsi="Times New Roman"/>
+                <w:color w:val="000000"/>
+                <w:sz w:val="22"/>
+              </w:rPr>
+              <w:t>CSKH</w:t>
+            </w:r>
+          </w:p>
+        </w:tc>
+      </w:tr>
+      <w:tr>
+        <w:tc>
+          <w:tcPr>
+            <w:tcW w:type="dxa" w:w="720"/>
+            <w:shd w:fill="FFFFFF"/>
+          </w:tcPr>
+          <w:p>
+            <w:pPr>
+              <w:spacing w:before="40" w:after="40"/>
+            </w:pPr>
+            <w:r>
+              <w:rPr>
+                <w:rFonts w:ascii="Times New Roman" w:hAnsi="Times New Roman"/>
+                <w:color w:val="000000"/>
+                <w:sz w:val="22"/>
+              </w:rPr>
+              <w:t>3</w:t>
+            </w:r>
+          </w:p>
+        </w:tc>
+        <w:tc>
+          <w:tcPr>
+            <w:tcW w:type="dxa" w:w="1728"/>
+            <w:shd w:fill="FFFFFF"/>
+          </w:tcPr>
+          <w:p>
+            <w:pPr>
+              <w:spacing w:before="40" w:after="40"/>
+            </w:pPr>
+            <w:r>
+              <w:rPr>
+                <w:rFonts w:ascii="Times New Roman" w:hAnsi="Times New Roman"/>
+                <w:color w:val="000000"/>
+                <w:sz w:val="22"/>
+              </w:rPr>
+              <w:t>Có cấu trúc</w:t>
+            </w:r>
+          </w:p>
+        </w:tc>
+        <w:tc>
+          <w:tcPr>
+            <w:tcW w:type="dxa" w:w="5040"/>
+            <w:shd w:fill="FFFFFF"/>
+          </w:tcPr>
+          <w:p>
+            <w:pPr>
+              <w:spacing w:before="40" w:after="40"/>
+            </w:pPr>
+            <w:r>
+              <w:rPr>
+                <w:rFonts w:ascii="Times New Roman" w:hAnsi="Times New Roman"/>
+                <w:color w:val="000000"/>
+                <w:sz w:val="22"/>
+              </w:rPr>
+              <w:t>Tỷ lệ hồ sơ phải yêu cầu khách bổ sung chứng từ chiếm bao nhiêu phần trăm tổng số đơn? (đơn vị: %)</w:t>
+            </w:r>
+          </w:p>
+        </w:tc>
+        <w:tc>
+          <w:tcPr>
+            <w:tcW w:type="dxa" w:w="1872"/>
+            <w:shd w:fill="FFFFFF"/>
+          </w:tcPr>
+          <w:p>
+            <w:pPr>
+              <w:spacing w:before="40" w:after="40"/>
+            </w:pPr>
+            <w:r>
+              <w:rPr>
+                <w:rFonts w:ascii="Times New Roman" w:hAnsi="Times New Roman"/>
+                <w:color w:val="000000"/>
+                <w:sz w:val="22"/>
+              </w:rPr>
+              <w:t>CSKH</w:t>
+            </w:r>
+          </w:p>
+        </w:tc>
+      </w:tr>
+      <w:tr>
+        <w:tc>
+          <w:tcPr>
+            <w:tcW w:type="dxa" w:w="720"/>
+            <w:shd w:fill="F5F5F5"/>
+          </w:tcPr>
+          <w:p>
+            <w:pPr>
+              <w:spacing w:before="40" w:after="40"/>
+            </w:pPr>
+            <w:r>
+              <w:rPr>
+                <w:rFonts w:ascii="Times New Roman" w:hAnsi="Times New Roman"/>
+                <w:color w:val="000000"/>
+                <w:sz w:val="22"/>
+              </w:rPr>
+              <w:t>4</w:t>
+            </w:r>
+          </w:p>
+        </w:tc>
+        <w:tc>
+          <w:tcPr>
+            <w:tcW w:type="dxa" w:w="1728"/>
+            <w:shd w:fill="F5F5F5"/>
+          </w:tcPr>
+          <w:p>
+            <w:pPr>
+              <w:spacing w:before="40" w:after="40"/>
+            </w:pPr>
+            <w:r>
+              <w:rPr>
+                <w:rFonts w:ascii="Times New Roman" w:hAnsi="Times New Roman"/>
+                <w:color w:val="000000"/>
+                <w:sz w:val="22"/>
+              </w:rPr>
+              <w:t>Có cấu trúc</w:t>
+            </w:r>
+          </w:p>
+        </w:tc>
+        <w:tc>
+          <w:tcPr>
+            <w:tcW w:type="dxa" w:w="5040"/>
+            <w:shd w:fill="F5F5F5"/>
+          </w:tcPr>
+          <w:p>
+            <w:pPr>
+              <w:spacing w:before="40" w:after="40"/>
+            </w:pPr>
+            <w:r>
+              <w:rPr>
+                <w:rFonts w:ascii="Times New Roman" w:hAnsi="Times New Roman"/>
+                <w:color w:val="000000"/>
+                <w:sz w:val="22"/>
+              </w:rPr>
+              <w:t>Trung bình Shipper cần bao nhiêu phút để hoàn tất thu hồi hàng từ khách hàng (tính từ lúc đến địa chỉ)? (đơn vị: phút)</w:t>
+            </w:r>
+          </w:p>
+        </w:tc>
+        <w:tc>
+          <w:tcPr>
+            <w:tcW w:type="dxa" w:w="1872"/>
+            <w:shd w:fill="F5F5F5"/>
+          </w:tcPr>
+          <w:p>
+            <w:pPr>
+              <w:spacing w:before="40" w:after="40"/>
+            </w:pPr>
+            <w:r>
+              <w:rPr>
+                <w:rFonts w:ascii="Times New Roman" w:hAnsi="Times New Roman"/>
+                <w:color w:val="000000"/>
+                <w:sz w:val="22"/>
+              </w:rPr>
+              <w:t>Shipper</w:t>
+            </w:r>
+          </w:p>
+        </w:tc>
+      </w:tr>
+      <w:tr>
+        <w:tc>
+          <w:tcPr>
+            <w:tcW w:type="dxa" w:w="720"/>
+            <w:shd w:fill="FFFFFF"/>
+          </w:tcPr>
+          <w:p>
+            <w:pPr>
+              <w:spacing w:before="40" w:after="40"/>
+            </w:pPr>
+            <w:r>
+              <w:rPr>
+                <w:rFonts w:ascii="Times New Roman" w:hAnsi="Times New Roman"/>
+                <w:color w:val="000000"/>
+                <w:sz w:val="22"/>
+              </w:rPr>
+              <w:t>5</w:t>
+            </w:r>
+          </w:p>
+        </w:tc>
+        <w:tc>
+          <w:tcPr>
+            <w:tcW w:type="dxa" w:w="1728"/>
+            <w:shd w:fill="FFFFFF"/>
+          </w:tcPr>
+          <w:p>
+            <w:pPr>
+              <w:spacing w:before="40" w:after="40"/>
+            </w:pPr>
+            <w:r>
+              <w:rPr>
+                <w:rFonts w:ascii="Times New Roman" w:hAnsi="Times New Roman"/>
+                <w:color w:val="000000"/>
+                <w:sz w:val="22"/>
+              </w:rPr>
+              <w:t>Có cấu trúc</w:t>
+            </w:r>
+          </w:p>
+        </w:tc>
+        <w:tc>
+          <w:tcPr>
+            <w:tcW w:type="dxa" w:w="5040"/>
+            <w:shd w:fill="FFFFFF"/>
+          </w:tcPr>
+          <w:p>
+            <w:pPr>
+              <w:spacing w:before="40" w:after="40"/>
+            </w:pPr>
+            <w:r>
+              <w:rPr>
+                <w:rFonts w:ascii="Times New Roman" w:hAnsi="Times New Roman"/>
+                <w:color w:val="000000"/>
+                <w:sz w:val="22"/>
+              </w:rPr>
+              <w:t>Thời gian trung bình hàng hoàn tồn đọng tại kho chờ phê duyệt biên bản bất thường là bao lâu? (đơn vị: giờ)</w:t>
+            </w:r>
+          </w:p>
+        </w:tc>
+        <w:tc>
+          <w:tcPr>
+            <w:tcW w:type="dxa" w:w="1872"/>
+            <w:shd w:fill="FFFFFF"/>
+          </w:tcPr>
+          <w:p>
+            <w:pPr>
+              <w:spacing w:before="40" w:after="40"/>
+            </w:pPr>
+            <w:r>
+              <w:rPr>
+                <w:rFonts w:ascii="Times New Roman" w:hAnsi="Times New Roman"/>
+                <w:color w:val="000000"/>
+                <w:sz w:val="22"/>
+              </w:rPr>
+              <w:t>Kho</w:t>
+            </w:r>
+          </w:p>
+        </w:tc>
+      </w:tr>
+      <w:tr>
+        <w:tc>
+          <w:tcPr>
+            <w:tcW w:type="dxa" w:w="720"/>
+            <w:shd w:fill="F5F5F5"/>
+          </w:tcPr>
+          <w:p>
+            <w:pPr>
+              <w:spacing w:before="40" w:after="40"/>
+            </w:pPr>
+            <w:r>
+              <w:rPr>
+                <w:rFonts w:ascii="Times New Roman" w:hAnsi="Times New Roman"/>
+                <w:color w:val="000000"/>
+                <w:sz w:val="22"/>
+              </w:rPr>
+              <w:t>6</w:t>
+            </w:r>
+          </w:p>
+        </w:tc>
+        <w:tc>
+          <w:tcPr>
+            <w:tcW w:type="dxa" w:w="1728"/>
+            <w:shd w:fill="F5F5F5"/>
+          </w:tcPr>
+          <w:p>
+            <w:pPr>
+              <w:spacing w:before="40" w:after="40"/>
+            </w:pPr>
+            <w:r>
+              <w:rPr>
+                <w:rFonts w:ascii="Times New Roman" w:hAnsi="Times New Roman"/>
+                <w:color w:val="000000"/>
+                <w:sz w:val="22"/>
+              </w:rPr>
+              <w:t>Không cấu trúc</w:t>
+            </w:r>
+          </w:p>
+        </w:tc>
+        <w:tc>
+          <w:tcPr>
+            <w:tcW w:type="dxa" w:w="5040"/>
+            <w:shd w:fill="F5F5F5"/>
+          </w:tcPr>
+          <w:p>
+            <w:pPr>
+              <w:spacing w:before="40" w:after="40"/>
+            </w:pPr>
+            <w:r>
+              <w:rPr>
+                <w:rFonts w:ascii="Times New Roman" w:hAnsi="Times New Roman"/>
+                <w:color w:val="000000"/>
+                <w:sz w:val="22"/>
+              </w:rPr>
+              <w:t>Theo ước tính của Anh/Chị, chi phí trung bình để xử lý một đơn hoàn trả từ đầu đến cuối là bao nhiêu?</w:t>
+            </w:r>
+          </w:p>
+        </w:tc>
+        <w:tc>
+          <w:tcPr>
+            <w:tcW w:type="dxa" w:w="1872"/>
+            <w:shd w:fill="F5F5F5"/>
+          </w:tcPr>
+          <w:p>
+            <w:pPr>
+              <w:spacing w:before="40" w:after="40"/>
+            </w:pPr>
+            <w:r>
+              <w:rPr>
+                <w:rFonts w:ascii="Times New Roman" w:hAnsi="Times New Roman"/>
+                <w:color w:val="000000"/>
+                <w:sz w:val="22"/>
+              </w:rPr>
+              <w:t>Quản lý CSKH</w:t>
+            </w:r>
+          </w:p>
+        </w:tc>
+      </w:tr>
+      <w:tr>
+        <w:tc>
+          <w:tcPr>
+            <w:tcW w:type="dxa" w:w="720"/>
+            <w:shd w:fill="FFFFFF"/>
+          </w:tcPr>
+          <w:p>
+            <w:pPr>
+              <w:spacing w:before="40" w:after="40"/>
+            </w:pPr>
+            <w:r>
+              <w:rPr>
+                <w:rFonts w:ascii="Times New Roman" w:hAnsi="Times New Roman"/>
+                <w:color w:val="000000"/>
+                <w:sz w:val="22"/>
+              </w:rPr>
+              <w:t>7</w:t>
+            </w:r>
+          </w:p>
+        </w:tc>
+        <w:tc>
+          <w:tcPr>
+            <w:tcW w:type="dxa" w:w="1728"/>
+            <w:shd w:fill="FFFFFF"/>
+          </w:tcPr>
+          <w:p>
+            <w:pPr>
+              <w:spacing w:before="40" w:after="40"/>
+            </w:pPr>
+            <w:r>
+              <w:rPr>
+                <w:rFonts w:ascii="Times New Roman" w:hAnsi="Times New Roman"/>
+                <w:color w:val="000000"/>
+                <w:sz w:val="22"/>
+              </w:rPr>
+              <w:t>Không cấu trúc</w:t>
+            </w:r>
+          </w:p>
+        </w:tc>
+        <w:tc>
+          <w:tcPr>
+            <w:tcW w:type="dxa" w:w="5040"/>
+            <w:shd w:fill="FFFFFF"/>
+          </w:tcPr>
+          <w:p>
+            <w:pPr>
+              <w:spacing w:before="40" w:after="40"/>
+            </w:pPr>
+            <w:r>
+              <w:rPr>
+                <w:rFonts w:ascii="Times New Roman" w:hAnsi="Times New Roman"/>
+                <w:color w:val="000000"/>
+                <w:sz w:val="22"/>
+              </w:rPr>
+              <w:t>Anh/Chị ước tính bao nhiêu phần trăm thời gian trong ca làm việc dành cho việc trao đổi thủ công với Kho?</w:t>
+            </w:r>
+          </w:p>
+        </w:tc>
+        <w:tc>
+          <w:tcPr>
+            <w:tcW w:type="dxa" w:w="1872"/>
+            <w:shd w:fill="FFFFFF"/>
+          </w:tcPr>
+          <w:p>
+            <w:pPr>
+              <w:spacing w:before="40" w:after="40"/>
+            </w:pPr>
+            <w:r>
+              <w:rPr>
+                <w:rFonts w:ascii="Times New Roman" w:hAnsi="Times New Roman"/>
+                <w:color w:val="000000"/>
+                <w:sz w:val="22"/>
+              </w:rPr>
+              <w:t>CSKH</w:t>
+            </w:r>
+          </w:p>
+        </w:tc>
+      </w:tr>
+      <w:tr>
+        <w:tc>
+          <w:tcPr>
+            <w:tcW w:type="dxa" w:w="720"/>
+            <w:shd w:fill="F5F5F5"/>
+          </w:tcPr>
+          <w:p>
+            <w:pPr>
+              <w:spacing w:before="40" w:after="40"/>
+            </w:pPr>
+            <w:r>
+              <w:rPr>
+                <w:rFonts w:ascii="Times New Roman" w:hAnsi="Times New Roman"/>
+                <w:color w:val="000000"/>
+                <w:sz w:val="22"/>
+              </w:rPr>
+              <w:t>8</w:t>
+            </w:r>
+          </w:p>
+        </w:tc>
+        <w:tc>
+          <w:tcPr>
+            <w:tcW w:type="dxa" w:w="1728"/>
+            <w:shd w:fill="F5F5F5"/>
+          </w:tcPr>
+          <w:p>
+            <w:pPr>
+              <w:spacing w:before="40" w:after="40"/>
+            </w:pPr>
+            <w:r>
+              <w:rPr>
+                <w:rFonts w:ascii="Times New Roman" w:hAnsi="Times New Roman"/>
+                <w:color w:val="000000"/>
+                <w:sz w:val="22"/>
+              </w:rPr>
+              <w:t>Không cấu trúc</w:t>
+            </w:r>
+          </w:p>
+        </w:tc>
+        <w:tc>
+          <w:tcPr>
+            <w:tcW w:type="dxa" w:w="5040"/>
+            <w:shd w:fill="F5F5F5"/>
+          </w:tcPr>
+          <w:p>
+            <w:pPr>
+              <w:spacing w:before="40" w:after="40"/>
+            </w:pPr>
+            <w:r>
+              <w:rPr>
+                <w:rFonts w:ascii="Times New Roman" w:hAnsi="Times New Roman"/>
+                <w:color w:val="000000"/>
+                <w:sz w:val="22"/>
+              </w:rPr>
+              <w:t>Trong mùa cao điểm, số lượng đơn hoàn trả tăng khoảng bao nhiêu lần so với ngày thường?</w:t>
+            </w:r>
+          </w:p>
+        </w:tc>
+        <w:tc>
+          <w:tcPr>
+            <w:tcW w:type="dxa" w:w="1872"/>
+            <w:shd w:fill="F5F5F5"/>
+          </w:tcPr>
+          <w:p>
+            <w:pPr>
+              <w:spacing w:before="40" w:after="40"/>
+            </w:pPr>
+            <w:r>
+              <w:rPr>
+                <w:rFonts w:ascii="Times New Roman" w:hAnsi="Times New Roman"/>
+                <w:color w:val="000000"/>
+                <w:sz w:val="22"/>
+              </w:rPr>
+              <w:t>Quản lý CSKH</w:t>
+            </w:r>
+          </w:p>
+        </w:tc>
+      </w:tr>
+      <w:tr>
+        <w:tc>
+          <w:tcPr>
+            <w:tcW w:type="dxa" w:w="720"/>
+            <w:shd w:fill="FFFFFF"/>
+          </w:tcPr>
+          <w:p>
+            <w:pPr>
+              <w:spacing w:before="40" w:after="40"/>
+            </w:pPr>
+            <w:r>
+              <w:rPr>
+                <w:rFonts w:ascii="Times New Roman" w:hAnsi="Times New Roman"/>
+                <w:color w:val="000000"/>
+                <w:sz w:val="22"/>
+              </w:rPr>
+              <w:t>9</w:t>
+            </w:r>
+          </w:p>
+        </w:tc>
+        <w:tc>
+          <w:tcPr>
+            <w:tcW w:type="dxa" w:w="1728"/>
+            <w:shd w:fill="FFFFFF"/>
+          </w:tcPr>
+          <w:p>
+            <w:pPr>
+              <w:spacing w:before="40" w:after="40"/>
+            </w:pPr>
+            <w:r>
+              <w:rPr>
+                <w:rFonts w:ascii="Times New Roman" w:hAnsi="Times New Roman"/>
+                <w:color w:val="000000"/>
+                <w:sz w:val="22"/>
+              </w:rPr>
+              <w:t>Không cấu trúc</w:t>
+            </w:r>
+          </w:p>
+        </w:tc>
+        <w:tc>
+          <w:tcPr>
+            <w:tcW w:type="dxa" w:w="5040"/>
+            <w:shd w:fill="FFFFFF"/>
+          </w:tcPr>
+          <w:p>
+            <w:pPr>
+              <w:spacing w:before="40" w:after="40"/>
+            </w:pPr>
+            <w:r>
+              <w:rPr>
+                <w:rFonts w:ascii="Times New Roman" w:hAnsi="Times New Roman"/>
+                <w:color w:val="000000"/>
+                <w:sz w:val="22"/>
+              </w:rPr>
+              <w:t>Anh/Chị ước tính bao nhiêu phần trăm khách hàng vắng nhà khi Shipper đến thu hồi hàng lần đầu?</w:t>
+            </w:r>
+          </w:p>
+        </w:tc>
+        <w:tc>
+          <w:tcPr>
+            <w:tcW w:type="dxa" w:w="1872"/>
+            <w:shd w:fill="FFFFFF"/>
+          </w:tcPr>
+          <w:p>
+            <w:pPr>
+              <w:spacing w:before="40" w:after="40"/>
+            </w:pPr>
+            <w:r>
+              <w:rPr>
+                <w:rFonts w:ascii="Times New Roman" w:hAnsi="Times New Roman"/>
+                <w:color w:val="000000"/>
+                <w:sz w:val="22"/>
+              </w:rPr>
+              <w:t>Shipper</w:t>
+            </w:r>
+          </w:p>
+        </w:tc>
+      </w:tr>
+      <w:tr>
+        <w:tc>
+          <w:tcPr>
+            <w:tcW w:type="dxa" w:w="720"/>
+            <w:shd w:fill="F5F5F5"/>
+          </w:tcPr>
+          <w:p>
+            <w:pPr>
+              <w:spacing w:before="40" w:after="40"/>
+            </w:pPr>
+            <w:r>
+              <w:rPr>
+                <w:rFonts w:ascii="Times New Roman" w:hAnsi="Times New Roman"/>
+                <w:color w:val="000000"/>
+                <w:sz w:val="22"/>
+              </w:rPr>
+              <w:t>10</w:t>
+            </w:r>
+          </w:p>
+        </w:tc>
+        <w:tc>
+          <w:tcPr>
+            <w:tcW w:type="dxa" w:w="1728"/>
+            <w:shd w:fill="F5F5F5"/>
+          </w:tcPr>
+          <w:p>
+            <w:pPr>
+              <w:spacing w:before="40" w:after="40"/>
+            </w:pPr>
+            <w:r>
+              <w:rPr>
+                <w:rFonts w:ascii="Times New Roman" w:hAnsi="Times New Roman"/>
+                <w:color w:val="000000"/>
+                <w:sz w:val="22"/>
+              </w:rPr>
+              <w:t>Không cấu trúc</w:t>
+            </w:r>
+          </w:p>
+        </w:tc>
+        <w:tc>
+          <w:tcPr>
+            <w:tcW w:type="dxa" w:w="5040"/>
+            <w:shd w:fill="F5F5F5"/>
+          </w:tcPr>
+          <w:p>
+            <w:pPr>
+              <w:spacing w:before="40" w:after="40"/>
+            </w:pPr>
+            <w:r>
+              <w:rPr>
+                <w:rFonts w:ascii="Times New Roman" w:hAnsi="Times New Roman"/>
+                <w:color w:val="000000"/>
+                <w:sz w:val="22"/>
+              </w:rPr>
+              <w:t>Nếu triển khai chữ ký số thay biên bản giấy, Anh/Chị ước tính tiết kiệm được bao nhiêu thời gian mỗi ngày?</w:t>
+            </w:r>
+          </w:p>
+        </w:tc>
+        <w:tc>
+          <w:tcPr>
+            <w:tcW w:type="dxa" w:w="1872"/>
+            <w:shd w:fill="F5F5F5"/>
+          </w:tcPr>
+          <w:p>
+            <w:pPr>
+              <w:spacing w:before="40" w:after="40"/>
+            </w:pPr>
+            <w:r>
+              <w:rPr>
+                <w:rFonts w:ascii="Times New Roman" w:hAnsi="Times New Roman"/>
+                <w:color w:val="000000"/>
+                <w:sz w:val="22"/>
+              </w:rPr>
+              <w:t>Kho</w:t>
+            </w:r>
+          </w:p>
+        </w:tc>
+      </w:tr>
+    </w:tbl>
+    <w:p>
+      <w:pPr>
+        <w:spacing w:before="40" w:after="80"/>
+        <w:jc w:val="left"/>
+      </w:pPr>
+      <w:r>
+        <w:rPr>
+          <w:rFonts w:ascii="Times New Roman" w:hAnsi="Times New Roman"/>
+          <w:b w:val="0"/>
+          <w:i w:val="0"/>
+          <w:color w:val="000000"/>
+          <w:sz w:val="22"/>
+        </w:rPr>
+        <w:t>5 câu đầu là câu hỏi có cấu trúc (đơn vị đo lường cố định), 5 câu sau là câu hỏi không cấu trúc (ước lượng mở, không có thang đo cố định):</w:t>
+      </w:r>
+    </w:p>
+    <w:p>
+      <w:pPr>
+        <w:spacing w:before="120" w:after="60"/>
+        <w:jc w:val="left"/>
+      </w:pPr>
+      <w:r>
+        <w:rPr>
+          <w:rFonts w:ascii="Times New Roman" w:hAnsi="Times New Roman"/>
+          <w:b/>
+          <w:i w:val="0"/>
+          <w:color w:val="000000"/>
+          <w:sz w:val="26"/>
+        </w:rPr>
+        <w:t>3.8.1.2.2. Câu hỏi định lượng</w:t>
+      </w:r>
+    </w:p>
+    <w:tbl>
+      <w:tblPr>
+        <w:tblW w:type="auto" w:w="0"/>
+        <w:jc w:val="center"/>
+        <w:tblLook w:firstColumn="1" w:firstRow="1" w:lastColumn="0" w:lastRow="0" w:noHBand="0" w:noVBand="1" w:val="04A0"/>
+      </w:tblPr>
+      <w:tblGrid>
+        <w:gridCol w:w="2340"/>
+        <w:gridCol w:w="2340"/>
+        <w:gridCol w:w="2340"/>
+        <w:gridCol w:w="2340"/>
+      </w:tblGrid>
+      <w:tr>
+        <w:tc>
+          <w:tcPr>
+            <w:tcW w:type="dxa" w:w="720"/>
+            <w:shd w:fill="333333"/>
+          </w:tcPr>
+          <w:p>
+            <w:pPr>
+              <w:spacing w:before="60" w:after="60"/>
+              <w:jc w:val="center"/>
+            </w:pPr>
+            <w:r>
+              <w:rPr>
+                <w:rFonts w:ascii="Times New Roman" w:hAnsi="Times New Roman"/>
+                <w:b/>
+                <w:color w:val="FFFFFF"/>
+                <w:sz w:val="22"/>
+              </w:rPr>
+              <w:t>STT</w:t>
+            </w:r>
+          </w:p>
+        </w:tc>
+        <w:tc>
+          <w:tcPr>
+            <w:tcW w:type="dxa" w:w="1728"/>
+            <w:shd w:fill="333333"/>
+          </w:tcPr>
+          <w:p>
+            <w:pPr>
+              <w:spacing w:before="60" w:after="60"/>
+              <w:jc w:val="center"/>
+            </w:pPr>
+            <w:r>
+              <w:rPr>
+                <w:rFonts w:ascii="Times New Roman" w:hAnsi="Times New Roman"/>
+                <w:b/>
+                <w:color w:val="FFFFFF"/>
+                <w:sz w:val="22"/>
+              </w:rPr>
+              <w:t>Loại</w:t>
+            </w:r>
+          </w:p>
+        </w:tc>
+        <w:tc>
+          <w:tcPr>
+            <w:tcW w:type="dxa" w:w="5040"/>
+            <w:shd w:fill="333333"/>
+          </w:tcPr>
+          <w:p>
+            <w:pPr>
+              <w:spacing w:before="60" w:after="60"/>
+              <w:jc w:val="center"/>
+            </w:pPr>
+            <w:r>
+              <w:rPr>
+                <w:rFonts w:ascii="Times New Roman" w:hAnsi="Times New Roman"/>
+                <w:b/>
+                <w:color w:val="FFFFFF"/>
+                <w:sz w:val="22"/>
+              </w:rPr>
+              <w:t>Câu hỏi</w:t>
+            </w:r>
+          </w:p>
+        </w:tc>
+        <w:tc>
+          <w:tcPr>
+            <w:tcW w:type="dxa" w:w="1872"/>
+            <w:shd w:fill="333333"/>
+          </w:tcPr>
+          <w:p>
+            <w:pPr>
+              <w:spacing w:before="60" w:after="60"/>
+              <w:jc w:val="center"/>
+            </w:pPr>
+            <w:r>
+              <w:rPr>
+                <w:rFonts w:ascii="Times New Roman" w:hAnsi="Times New Roman"/>
+                <w:b/>
+                <w:color w:val="FFFFFF"/>
+                <w:sz w:val="22"/>
+              </w:rPr>
+              <w:t>Đối tượng</w:t>
+            </w:r>
+          </w:p>
+        </w:tc>
+      </w:tr>
+      <w:tr>
+        <w:tc>
+          <w:tcPr>
+            <w:tcW w:type="dxa" w:w="720"/>
+            <w:shd w:fill="FFFFFF"/>
+          </w:tcPr>
+          <w:p>
+            <w:pPr>
+              <w:spacing w:before="40" w:after="40"/>
+            </w:pPr>
+            <w:r>
+              <w:rPr>
+                <w:rFonts w:ascii="Times New Roman" w:hAnsi="Times New Roman"/>
+                <w:color w:val="000000"/>
+                <w:sz w:val="22"/>
+              </w:rPr>
+              <w:t>1</w:t>
+            </w:r>
+          </w:p>
+        </w:tc>
+        <w:tc>
+          <w:tcPr>
+            <w:tcW w:type="dxa" w:w="1728"/>
+            <w:shd w:fill="FFFFFF"/>
+          </w:tcPr>
+          <w:p>
+            <w:pPr>
+              <w:spacing w:before="40" w:after="40"/>
+            </w:pPr>
+            <w:r>
+              <w:rPr>
+                <w:rFonts w:ascii="Times New Roman" w:hAnsi="Times New Roman"/>
+                <w:color w:val="000000"/>
+                <w:sz w:val="22"/>
+              </w:rPr>
+              <w:t>Có cấu trúc</w:t>
+            </w:r>
+          </w:p>
+        </w:tc>
+        <w:tc>
+          <w:tcPr>
+            <w:tcW w:type="dxa" w:w="5040"/>
+            <w:shd w:fill="FFFFFF"/>
+          </w:tcPr>
+          <w:p>
+            <w:pPr>
+              <w:spacing w:before="40" w:after="40"/>
+            </w:pPr>
+            <w:r>
+              <w:rPr>
+                <w:rFonts w:ascii="Times New Roman" w:hAnsi="Times New Roman"/>
+                <w:color w:val="000000"/>
+                <w:sz w:val="22"/>
+              </w:rPr>
+              <w:t>Anh/Chị đánh giá mức độ hài lòng về tốc độ phản hồi của CSKH khi nhận yêu cầu hoàn trả? (1-Rất không hài lòng → 5-Rất hài lòng)</w:t>
+            </w:r>
+          </w:p>
+        </w:tc>
+        <w:tc>
+          <w:tcPr>
+            <w:tcW w:type="dxa" w:w="1872"/>
+            <w:shd w:fill="FFFFFF"/>
+          </w:tcPr>
+          <w:p>
+            <w:pPr>
+              <w:spacing w:before="40" w:after="40"/>
+            </w:pPr>
+            <w:r>
+              <w:rPr>
+                <w:rFonts w:ascii="Times New Roman" w:hAnsi="Times New Roman"/>
+                <w:color w:val="000000"/>
+                <w:sz w:val="22"/>
+              </w:rPr>
+              <w:t>Khách hàng</w:t>
+            </w:r>
+          </w:p>
+        </w:tc>
+      </w:tr>
+      <w:tr>
+        <w:tc>
+          <w:tcPr>
+            <w:tcW w:type="dxa" w:w="720"/>
+            <w:shd w:fill="F5F5F5"/>
+          </w:tcPr>
+          <w:p>
+            <w:pPr>
+              <w:spacing w:before="40" w:after="40"/>
+            </w:pPr>
+            <w:r>
+              <w:rPr>
+                <w:rFonts w:ascii="Times New Roman" w:hAnsi="Times New Roman"/>
+                <w:color w:val="000000"/>
+                <w:sz w:val="22"/>
+              </w:rPr>
+              <w:t>2</w:t>
+            </w:r>
+          </w:p>
+        </w:tc>
+        <w:tc>
+          <w:tcPr>
+            <w:tcW w:type="dxa" w:w="1728"/>
+            <w:shd w:fill="F5F5F5"/>
+          </w:tcPr>
+          <w:p>
+            <w:pPr>
+              <w:spacing w:before="40" w:after="40"/>
+            </w:pPr>
+            <w:r>
+              <w:rPr>
+                <w:rFonts w:ascii="Times New Roman" w:hAnsi="Times New Roman"/>
+                <w:color w:val="000000"/>
+                <w:sz w:val="22"/>
+              </w:rPr>
+              <w:t>Có cấu trúc</w:t>
+            </w:r>
+          </w:p>
+        </w:tc>
+        <w:tc>
+          <w:tcPr>
+            <w:tcW w:type="dxa" w:w="5040"/>
+            <w:shd w:fill="F5F5F5"/>
+          </w:tcPr>
+          <w:p>
+            <w:pPr>
+              <w:spacing w:before="40" w:after="40"/>
+            </w:pPr>
+            <w:r>
+              <w:rPr>
+                <w:rFonts w:ascii="Times New Roman" w:hAnsi="Times New Roman"/>
+                <w:color w:val="000000"/>
+                <w:sz w:val="22"/>
+              </w:rPr>
+              <w:t>Hệ thống CRM hiện tại có đáp ứng đủ các tính năng cần thiết cho việc tra cứu và xử lý đơn hoàn trả không? (Có/Không/Một phần)</w:t>
+            </w:r>
+          </w:p>
+        </w:tc>
+        <w:tc>
+          <w:tcPr>
+            <w:tcW w:type="dxa" w:w="1872"/>
+            <w:shd w:fill="F5F5F5"/>
+          </w:tcPr>
+          <w:p>
+            <w:pPr>
+              <w:spacing w:before="40" w:after="40"/>
+            </w:pPr>
+            <w:r>
+              <w:rPr>
+                <w:rFonts w:ascii="Times New Roman" w:hAnsi="Times New Roman"/>
+                <w:color w:val="000000"/>
+                <w:sz w:val="22"/>
+              </w:rPr>
+              <w:t>CSKH</w:t>
+            </w:r>
+          </w:p>
+        </w:tc>
+      </w:tr>
+      <w:tr>
+        <w:tc>
+          <w:tcPr>
+            <w:tcW w:type="dxa" w:w="720"/>
+            <w:shd w:fill="FFFFFF"/>
+          </w:tcPr>
+          <w:p>
+            <w:pPr>
+              <w:spacing w:before="40" w:after="40"/>
+            </w:pPr>
+            <w:r>
+              <w:rPr>
+                <w:rFonts w:ascii="Times New Roman" w:hAnsi="Times New Roman"/>
+                <w:color w:val="000000"/>
+                <w:sz w:val="22"/>
+              </w:rPr>
+              <w:t>3</w:t>
+            </w:r>
+          </w:p>
+        </w:tc>
+        <w:tc>
+          <w:tcPr>
+            <w:tcW w:type="dxa" w:w="1728"/>
+            <w:shd w:fill="FFFFFF"/>
+          </w:tcPr>
+          <w:p>
+            <w:pPr>
+              <w:spacing w:before="40" w:after="40"/>
+            </w:pPr>
+            <w:r>
+              <w:rPr>
+                <w:rFonts w:ascii="Times New Roman" w:hAnsi="Times New Roman"/>
+                <w:color w:val="000000"/>
+                <w:sz w:val="22"/>
+              </w:rPr>
+              <w:t>Có cấu trúc</w:t>
+            </w:r>
+          </w:p>
+        </w:tc>
+        <w:tc>
+          <w:tcPr>
+            <w:tcW w:type="dxa" w:w="5040"/>
+            <w:shd w:fill="FFFFFF"/>
+          </w:tcPr>
+          <w:p>
+            <w:pPr>
+              <w:spacing w:before="40" w:after="40"/>
+            </w:pPr>
+            <w:r>
+              <w:rPr>
+                <w:rFonts w:ascii="Times New Roman" w:hAnsi="Times New Roman"/>
+                <w:color w:val="000000"/>
+                <w:sz w:val="22"/>
+              </w:rPr>
+              <w:t>Khi thu hồi hàng, Anh/Chị thường liên hệ được khách hàng trong lần gọi thứ mấy? (Lần 1 / Lần 2 / Lần 3 trở lên)</w:t>
+            </w:r>
+          </w:p>
+        </w:tc>
+        <w:tc>
+          <w:tcPr>
+            <w:tcW w:type="dxa" w:w="1872"/>
+            <w:shd w:fill="FFFFFF"/>
+          </w:tcPr>
+          <w:p>
+            <w:pPr>
+              <w:spacing w:before="40" w:after="40"/>
+            </w:pPr>
+            <w:r>
+              <w:rPr>
+                <w:rFonts w:ascii="Times New Roman" w:hAnsi="Times New Roman"/>
+                <w:color w:val="000000"/>
+                <w:sz w:val="22"/>
+              </w:rPr>
+              <w:t>Shipper</w:t>
+            </w:r>
+          </w:p>
+        </w:tc>
+      </w:tr>
+      <w:tr>
+        <w:tc>
+          <w:tcPr>
+            <w:tcW w:type="dxa" w:w="720"/>
+            <w:shd w:fill="F5F5F5"/>
+          </w:tcPr>
+          <w:p>
+            <w:pPr>
+              <w:spacing w:before="40" w:after="40"/>
+            </w:pPr>
+            <w:r>
+              <w:rPr>
+                <w:rFonts w:ascii="Times New Roman" w:hAnsi="Times New Roman"/>
+                <w:color w:val="000000"/>
+                <w:sz w:val="22"/>
+              </w:rPr>
+              <w:t>4</w:t>
+            </w:r>
+          </w:p>
+        </w:tc>
+        <w:tc>
+          <w:tcPr>
+            <w:tcW w:type="dxa" w:w="1728"/>
+            <w:shd w:fill="F5F5F5"/>
+          </w:tcPr>
+          <w:p>
+            <w:pPr>
+              <w:spacing w:before="40" w:after="40"/>
+            </w:pPr>
+            <w:r>
+              <w:rPr>
+                <w:rFonts w:ascii="Times New Roman" w:hAnsi="Times New Roman"/>
+                <w:color w:val="000000"/>
+                <w:sz w:val="22"/>
+              </w:rPr>
+              <w:t>Có cấu trúc</w:t>
+            </w:r>
+          </w:p>
+        </w:tc>
+        <w:tc>
+          <w:tcPr>
+            <w:tcW w:type="dxa" w:w="5040"/>
+            <w:shd w:fill="F5F5F5"/>
+          </w:tcPr>
+          <w:p>
+            <w:pPr>
+              <w:spacing w:before="40" w:after="40"/>
+            </w:pPr>
+            <w:r>
+              <w:rPr>
+                <w:rFonts w:ascii="Times New Roman" w:hAnsi="Times New Roman"/>
+                <w:color w:val="000000"/>
+                <w:sz w:val="22"/>
+              </w:rPr>
+              <w:t>Quy trình phê duyệt biên bản bất thường tại kho hiện trải qua bao nhiêu cấp duyệt? (1 cấp / 2 cấp / 3 cấp trở lên)</w:t>
+            </w:r>
+          </w:p>
+        </w:tc>
+        <w:tc>
+          <w:tcPr>
+            <w:tcW w:type="dxa" w:w="1872"/>
+            <w:shd w:fill="F5F5F5"/>
+          </w:tcPr>
+          <w:p>
+            <w:pPr>
+              <w:spacing w:before="40" w:after="40"/>
+            </w:pPr>
+            <w:r>
+              <w:rPr>
+                <w:rFonts w:ascii="Times New Roman" w:hAnsi="Times New Roman"/>
+                <w:color w:val="000000"/>
+                <w:sz w:val="22"/>
+              </w:rPr>
+              <w:t>Kho</w:t>
+            </w:r>
+          </w:p>
+        </w:tc>
+      </w:tr>
+      <w:tr>
+        <w:tc>
+          <w:tcPr>
+            <w:tcW w:type="dxa" w:w="720"/>
+            <w:shd w:fill="FFFFFF"/>
+          </w:tcPr>
+          <w:p>
+            <w:pPr>
+              <w:spacing w:before="40" w:after="40"/>
+            </w:pPr>
+            <w:r>
+              <w:rPr>
+                <w:rFonts w:ascii="Times New Roman" w:hAnsi="Times New Roman"/>
+                <w:color w:val="000000"/>
+                <w:sz w:val="22"/>
+              </w:rPr>
+              <w:t>5</w:t>
+            </w:r>
+          </w:p>
+        </w:tc>
+        <w:tc>
+          <w:tcPr>
+            <w:tcW w:type="dxa" w:w="1728"/>
+            <w:shd w:fill="FFFFFF"/>
+          </w:tcPr>
+          <w:p>
+            <w:pPr>
+              <w:spacing w:before="40" w:after="40"/>
+            </w:pPr>
+            <w:r>
+              <w:rPr>
+                <w:rFonts w:ascii="Times New Roman" w:hAnsi="Times New Roman"/>
+                <w:color w:val="000000"/>
+                <w:sz w:val="22"/>
+              </w:rPr>
+              <w:t>Có cấu trúc</w:t>
+            </w:r>
+          </w:p>
+        </w:tc>
+        <w:tc>
+          <w:tcPr>
+            <w:tcW w:type="dxa" w:w="5040"/>
+            <w:shd w:fill="FFFFFF"/>
+          </w:tcPr>
+          <w:p>
+            <w:pPr>
+              <w:spacing w:before="40" w:after="40"/>
+            </w:pPr>
+            <w:r>
+              <w:rPr>
+                <w:rFonts w:ascii="Times New Roman" w:hAnsi="Times New Roman"/>
+                <w:color w:val="000000"/>
+                <w:sz w:val="22"/>
+              </w:rPr>
+              <w:t>Anh/Chị có sử dụng ứng dụng di động để theo dõi trạng thái đơn hoàn trả không? (Luôn luôn / Thỉnh thoảng / Không bao giờ)</w:t>
+            </w:r>
+          </w:p>
+        </w:tc>
+        <w:tc>
+          <w:tcPr>
+            <w:tcW w:type="dxa" w:w="1872"/>
+            <w:shd w:fill="FFFFFF"/>
+          </w:tcPr>
+          <w:p>
+            <w:pPr>
+              <w:spacing w:before="40" w:after="40"/>
+            </w:pPr>
+            <w:r>
+              <w:rPr>
+                <w:rFonts w:ascii="Times New Roman" w:hAnsi="Times New Roman"/>
+                <w:color w:val="000000"/>
+                <w:sz w:val="22"/>
+              </w:rPr>
+              <w:t>Khách hàng</w:t>
+            </w:r>
+          </w:p>
+        </w:tc>
+      </w:tr>
+      <w:tr>
+        <w:tc>
+          <w:tcPr>
+            <w:tcW w:type="dxa" w:w="720"/>
+            <w:shd w:fill="F5F5F5"/>
+          </w:tcPr>
+          <w:p>
+            <w:pPr>
+              <w:spacing w:before="40" w:after="40"/>
+            </w:pPr>
+            <w:r>
+              <w:rPr>
+                <w:rFonts w:ascii="Times New Roman" w:hAnsi="Times New Roman"/>
+                <w:color w:val="000000"/>
+                <w:sz w:val="22"/>
+              </w:rPr>
+              <w:t>6</w:t>
+            </w:r>
+          </w:p>
+        </w:tc>
+        <w:tc>
+          <w:tcPr>
+            <w:tcW w:type="dxa" w:w="1728"/>
+            <w:shd w:fill="F5F5F5"/>
+          </w:tcPr>
+          <w:p>
+            <w:pPr>
+              <w:spacing w:before="40" w:after="40"/>
+            </w:pPr>
+            <w:r>
+              <w:rPr>
+                <w:rFonts w:ascii="Times New Roman" w:hAnsi="Times New Roman"/>
+                <w:color w:val="000000"/>
+                <w:sz w:val="22"/>
+              </w:rPr>
+              <w:t>Không cấu trúc</w:t>
+            </w:r>
+          </w:p>
+        </w:tc>
+        <w:tc>
+          <w:tcPr>
+            <w:tcW w:type="dxa" w:w="5040"/>
+            <w:shd w:fill="F5F5F5"/>
+          </w:tcPr>
+          <w:p>
+            <w:pPr>
+              <w:spacing w:before="40" w:after="40"/>
+            </w:pPr>
+            <w:r>
+              <w:rPr>
+                <w:rFonts w:ascii="Times New Roman" w:hAnsi="Times New Roman"/>
+                <w:color w:val="000000"/>
+                <w:sz w:val="22"/>
+              </w:rPr>
+              <w:t>Theo Anh/Chị, đâu là điểm nghẽn lớn nhất trong quy trình xử lý hoàn trả hàng hiện tại?</w:t>
+            </w:r>
+          </w:p>
+        </w:tc>
+        <w:tc>
+          <w:tcPr>
+            <w:tcW w:type="dxa" w:w="1872"/>
+            <w:shd w:fill="F5F5F5"/>
+          </w:tcPr>
+          <w:p>
+            <w:pPr>
+              <w:spacing w:before="40" w:after="40"/>
+            </w:pPr>
+            <w:r>
+              <w:rPr>
+                <w:rFonts w:ascii="Times New Roman" w:hAnsi="Times New Roman"/>
+                <w:color w:val="000000"/>
+                <w:sz w:val="22"/>
+              </w:rPr>
+              <w:t>CSKH</w:t>
+            </w:r>
+          </w:p>
+        </w:tc>
+      </w:tr>
+      <w:tr>
+        <w:tc>
+          <w:tcPr>
+            <w:tcW w:type="dxa" w:w="720"/>
+            <w:shd w:fill="FFFFFF"/>
+          </w:tcPr>
+          <w:p>
+            <w:pPr>
+              <w:spacing w:before="40" w:after="40"/>
+            </w:pPr>
+            <w:r>
+              <w:rPr>
+                <w:rFonts w:ascii="Times New Roman" w:hAnsi="Times New Roman"/>
+                <w:color w:val="000000"/>
+                <w:sz w:val="22"/>
+              </w:rPr>
+              <w:t>7</w:t>
+            </w:r>
+          </w:p>
+        </w:tc>
+        <w:tc>
+          <w:tcPr>
+            <w:tcW w:type="dxa" w:w="1728"/>
+            <w:shd w:fill="FFFFFF"/>
+          </w:tcPr>
+          <w:p>
+            <w:pPr>
+              <w:spacing w:before="40" w:after="40"/>
+            </w:pPr>
+            <w:r>
+              <w:rPr>
+                <w:rFonts w:ascii="Times New Roman" w:hAnsi="Times New Roman"/>
+                <w:color w:val="000000"/>
+                <w:sz w:val="22"/>
+              </w:rPr>
+              <w:t>Không cấu trúc</w:t>
+            </w:r>
+          </w:p>
+        </w:tc>
+        <w:tc>
+          <w:tcPr>
+            <w:tcW w:type="dxa" w:w="5040"/>
+            <w:shd w:fill="FFFFFF"/>
+          </w:tcPr>
+          <w:p>
+            <w:pPr>
+              <w:spacing w:before="40" w:after="40"/>
+            </w:pPr>
+            <w:r>
+              <w:rPr>
+                <w:rFonts w:ascii="Times New Roman" w:hAnsi="Times New Roman"/>
+                <w:color w:val="000000"/>
+                <w:sz w:val="22"/>
+              </w:rPr>
+              <w:t>Anh/Chị có thể mô tả một tình huống xử lý khiếu nại phức tạp gần đây và cách giải quyết?</w:t>
+            </w:r>
+          </w:p>
+        </w:tc>
+        <w:tc>
+          <w:tcPr>
+            <w:tcW w:type="dxa" w:w="1872"/>
+            <w:shd w:fill="FFFFFF"/>
+          </w:tcPr>
+          <w:p>
+            <w:pPr>
+              <w:spacing w:before="40" w:after="40"/>
+            </w:pPr>
+            <w:r>
+              <w:rPr>
+                <w:rFonts w:ascii="Times New Roman" w:hAnsi="Times New Roman"/>
+                <w:color w:val="000000"/>
+                <w:sz w:val="22"/>
+              </w:rPr>
+              <w:t>CSKH</w:t>
+            </w:r>
+          </w:p>
+        </w:tc>
+      </w:tr>
+      <w:tr>
+        <w:tc>
+          <w:tcPr>
+            <w:tcW w:type="dxa" w:w="720"/>
+            <w:shd w:fill="F5F5F5"/>
+          </w:tcPr>
+          <w:p>
+            <w:pPr>
+              <w:spacing w:before="40" w:after="40"/>
+            </w:pPr>
+            <w:r>
+              <w:rPr>
+                <w:rFonts w:ascii="Times New Roman" w:hAnsi="Times New Roman"/>
+                <w:color w:val="000000"/>
+                <w:sz w:val="22"/>
+              </w:rPr>
+              <w:t>8</w:t>
+            </w:r>
+          </w:p>
+        </w:tc>
+        <w:tc>
+          <w:tcPr>
+            <w:tcW w:type="dxa" w:w="1728"/>
+            <w:shd w:fill="F5F5F5"/>
+          </w:tcPr>
+          <w:p>
+            <w:pPr>
+              <w:spacing w:before="40" w:after="40"/>
+            </w:pPr>
+            <w:r>
+              <w:rPr>
+                <w:rFonts w:ascii="Times New Roman" w:hAnsi="Times New Roman"/>
+                <w:color w:val="000000"/>
+                <w:sz w:val="22"/>
+              </w:rPr>
+              <w:t>Không cấu trúc</w:t>
+            </w:r>
+          </w:p>
+        </w:tc>
+        <w:tc>
+          <w:tcPr>
+            <w:tcW w:type="dxa" w:w="5040"/>
+            <w:shd w:fill="F5F5F5"/>
+          </w:tcPr>
+          <w:p>
+            <w:pPr>
+              <w:spacing w:before="40" w:after="40"/>
+            </w:pPr>
+            <w:r>
+              <w:rPr>
+                <w:rFonts w:ascii="Times New Roman" w:hAnsi="Times New Roman"/>
+                <w:color w:val="000000"/>
+                <w:sz w:val="22"/>
+              </w:rPr>
+              <w:t>Những khó khăn chính khi thu hồi hàng từ khách hàng mà Anh/Chị thường gặp là gì?</w:t>
+            </w:r>
+          </w:p>
+        </w:tc>
+        <w:tc>
+          <w:tcPr>
+            <w:tcW w:type="dxa" w:w="1872"/>
+            <w:shd w:fill="F5F5F5"/>
+          </w:tcPr>
+          <w:p>
+            <w:pPr>
+              <w:spacing w:before="40" w:after="40"/>
+            </w:pPr>
+            <w:r>
+              <w:rPr>
+                <w:rFonts w:ascii="Times New Roman" w:hAnsi="Times New Roman"/>
+                <w:color w:val="000000"/>
+                <w:sz w:val="22"/>
+              </w:rPr>
+              <w:t>Shipper</w:t>
+            </w:r>
+          </w:p>
+        </w:tc>
+      </w:tr>
+      <w:tr>
+        <w:tc>
+          <w:tcPr>
+            <w:tcW w:type="dxa" w:w="720"/>
+            <w:shd w:fill="FFFFFF"/>
+          </w:tcPr>
+          <w:p>
+            <w:pPr>
+              <w:spacing w:before="40" w:after="40"/>
+            </w:pPr>
+            <w:r>
+              <w:rPr>
+                <w:rFonts w:ascii="Times New Roman" w:hAnsi="Times New Roman"/>
+                <w:color w:val="000000"/>
+                <w:sz w:val="22"/>
+              </w:rPr>
+              <w:t>9</w:t>
+            </w:r>
+          </w:p>
+        </w:tc>
+        <w:tc>
+          <w:tcPr>
+            <w:tcW w:type="dxa" w:w="1728"/>
+            <w:shd w:fill="FFFFFF"/>
+          </w:tcPr>
+          <w:p>
+            <w:pPr>
+              <w:spacing w:before="40" w:after="40"/>
+            </w:pPr>
+            <w:r>
+              <w:rPr>
+                <w:rFonts w:ascii="Times New Roman" w:hAnsi="Times New Roman"/>
+                <w:color w:val="000000"/>
+                <w:sz w:val="22"/>
+              </w:rPr>
+              <w:t>Không cấu trúc</w:t>
+            </w:r>
+          </w:p>
+        </w:tc>
+        <w:tc>
+          <w:tcPr>
+            <w:tcW w:type="dxa" w:w="5040"/>
+            <w:shd w:fill="FFFFFF"/>
+          </w:tcPr>
+          <w:p>
+            <w:pPr>
+              <w:spacing w:before="40" w:after="40"/>
+            </w:pPr>
+            <w:r>
+              <w:rPr>
+                <w:rFonts w:ascii="Times New Roman" w:hAnsi="Times New Roman"/>
+                <w:color w:val="000000"/>
+                <w:sz w:val="22"/>
+              </w:rPr>
+              <w:t>Anh/Chị đề xuất giải pháp gì để cải thiện quy trình kiểm tra hàng hoàn tại kho?</w:t>
+            </w:r>
+          </w:p>
+        </w:tc>
+        <w:tc>
+          <w:tcPr>
+            <w:tcW w:type="dxa" w:w="1872"/>
+            <w:shd w:fill="FFFFFF"/>
+          </w:tcPr>
+          <w:p>
+            <w:pPr>
+              <w:spacing w:before="40" w:after="40"/>
+            </w:pPr>
+            <w:r>
+              <w:rPr>
+                <w:rFonts w:ascii="Times New Roman" w:hAnsi="Times New Roman"/>
+                <w:color w:val="000000"/>
+                <w:sz w:val="22"/>
+              </w:rPr>
+              <w:t>Kho</w:t>
+            </w:r>
+          </w:p>
+        </w:tc>
+      </w:tr>
+      <w:tr>
+        <w:tc>
+          <w:tcPr>
+            <w:tcW w:type="dxa" w:w="720"/>
+            <w:shd w:fill="F5F5F5"/>
+          </w:tcPr>
+          <w:p>
+            <w:pPr>
+              <w:spacing w:before="40" w:after="40"/>
+            </w:pPr>
+            <w:r>
+              <w:rPr>
+                <w:rFonts w:ascii="Times New Roman" w:hAnsi="Times New Roman"/>
+                <w:color w:val="000000"/>
+                <w:sz w:val="22"/>
+              </w:rPr>
+              <w:t>10</w:t>
+            </w:r>
+          </w:p>
+        </w:tc>
+        <w:tc>
+          <w:tcPr>
+            <w:tcW w:type="dxa" w:w="1728"/>
+            <w:shd w:fill="F5F5F5"/>
+          </w:tcPr>
+          <w:p>
+            <w:pPr>
+              <w:spacing w:before="40" w:after="40"/>
+            </w:pPr>
+            <w:r>
+              <w:rPr>
+                <w:rFonts w:ascii="Times New Roman" w:hAnsi="Times New Roman"/>
+                <w:color w:val="000000"/>
+                <w:sz w:val="22"/>
+              </w:rPr>
+              <w:t>Không cấu trúc</w:t>
+            </w:r>
+          </w:p>
+        </w:tc>
+        <w:tc>
+          <w:tcPr>
+            <w:tcW w:type="dxa" w:w="5040"/>
+            <w:shd w:fill="F5F5F5"/>
+          </w:tcPr>
+          <w:p>
+            <w:pPr>
+              <w:spacing w:before="40" w:after="40"/>
+            </w:pPr>
+            <w:r>
+              <w:rPr>
+                <w:rFonts w:ascii="Times New Roman" w:hAnsi="Times New Roman"/>
+                <w:color w:val="000000"/>
+                <w:sz w:val="22"/>
+              </w:rPr>
+              <w:t>Theo Anh/Chị, việc tích hợp hệ thống CRM và WMS sẽ thay đổi quy trình làm việc hàng ngày như thế nào?</w:t>
+            </w:r>
+          </w:p>
+        </w:tc>
+        <w:tc>
+          <w:tcPr>
+            <w:tcW w:type="dxa" w:w="1872"/>
+            <w:shd w:fill="F5F5F5"/>
+          </w:tcPr>
+          <w:p>
+            <w:pPr>
+              <w:spacing w:before="40" w:after="40"/>
+            </w:pPr>
+            <w:r>
+              <w:rPr>
+                <w:rFonts w:ascii="Times New Roman" w:hAnsi="Times New Roman"/>
+                <w:color w:val="000000"/>
+                <w:sz w:val="22"/>
+              </w:rPr>
+              <w:t>CSKH / Kho</w:t>
+            </w:r>
+          </w:p>
+        </w:tc>
+      </w:tr>
+    </w:tbl>
+    <w:p>
+      <w:pPr>
+        <w:spacing w:before="40" w:after="80"/>
+        <w:jc w:val="left"/>
+      </w:pPr>
+      <w:r>
+        <w:rPr>
+          <w:rFonts w:ascii="Times New Roman" w:hAnsi="Times New Roman"/>
+          <w:b w:val="0"/>
+          <w:i w:val="0"/>
+          <w:color w:val="000000"/>
+          <w:sz w:val="22"/>
+        </w:rPr>
+        <w:t>5 câu đầu là câu hỏi có cấu trúc (đáp án theo thang đo/lựa chọn sẵn), 5 câu sau là câu hỏi không cấu trúc (câu hỏi mở):</w:t>
+      </w:r>
+    </w:p>
+    <w:p>
+      <w:pPr>
+        <w:spacing w:before="120" w:after="60"/>
+        <w:jc w:val="left"/>
+      </w:pPr>
+      <w:r>
+        <w:rPr>
+          <w:rFonts w:ascii="Times New Roman" w:hAnsi="Times New Roman"/>
+          <w:b/>
+          <w:i w:val="0"/>
+          <w:color w:val="000000"/>
+          <w:sz w:val="26"/>
+        </w:rPr>
+        <w:t>3.8.1.2.1. Câu hỏi định tính</w:t>
+      </w:r>
+    </w:p>
+    <w:p>
+      <w:pPr>
+        <w:spacing w:before="160" w:after="80"/>
+        <w:jc w:val="left"/>
+      </w:pPr>
+      <w:r>
+        <w:rPr>
+          <w:rFonts w:ascii="Times New Roman" w:hAnsi="Times New Roman"/>
+          <w:b/>
+          <w:i w:val="0"/>
+          <w:color w:val="000000"/>
+          <w:sz w:val="26"/>
+        </w:rPr>
+        <w:t>3.8.1.2. Phỏng vấn</w:t>
+      </w:r>
+    </w:p>
+    <w:p>
+      <w:pPr>
+        <w:pStyle w:val="ListParagraph"/>
+        <w:spacing w:before="20" w:after="40"/>
+      </w:pPr>
+      <w:r>
+        <w:rPr>
+          <w:rFonts w:ascii="Times New Roman" w:hAnsi="Times New Roman"/>
+          <w:b/>
+          <w:color w:val="000000"/>
+          <w:sz w:val="22"/>
+        </w:rPr>
+        <w:t xml:space="preserve">• </w:t>
+      </w:r>
+      <w:r>
+        <w:rPr>
+          <w:rFonts w:ascii="Times New Roman" w:hAnsi="Times New Roman"/>
+          <w:b w:val="0"/>
+          <w:color w:val="000000"/>
+          <w:sz w:val="22"/>
+        </w:rPr>
+        <w:t>Cảm ơn người tham gia và hẹn thời điểm phản hồi kết quả tổng hợp hoặc buổi làm việc tiếp theo.</w:t>
+      </w:r>
+    </w:p>
+    <w:p>
+      <w:pPr>
+        <w:pStyle w:val="ListParagraph"/>
+        <w:spacing w:before="20" w:after="40"/>
+      </w:pPr>
+      <w:r>
+        <w:rPr>
+          <w:rFonts w:ascii="Times New Roman" w:hAnsi="Times New Roman"/>
+          <w:b/>
+          <w:color w:val="000000"/>
+          <w:sz w:val="22"/>
+        </w:rPr>
+        <w:t xml:space="preserve">• </w:t>
+      </w:r>
+      <w:r>
+        <w:rPr>
+          <w:rFonts w:ascii="Times New Roman" w:hAnsi="Times New Roman"/>
+          <w:b w:val="0"/>
+          <w:color w:val="000000"/>
+          <w:sz w:val="22"/>
+        </w:rPr>
+        <w:t>Ghi nhận phản hồi, xác nhận lại với người được phỏng vấn để tránh hiểu sai thông tin.</w:t>
+      </w:r>
+    </w:p>
+    <w:p>
+      <w:pPr>
+        <w:pStyle w:val="ListParagraph"/>
+        <w:spacing w:before="20" w:after="40"/>
+      </w:pPr>
+      <w:r>
+        <w:rPr>
+          <w:rFonts w:ascii="Times New Roman" w:hAnsi="Times New Roman"/>
+          <w:b/>
+          <w:color w:val="000000"/>
+          <w:sz w:val="22"/>
+        </w:rPr>
+        <w:t xml:space="preserve">• </w:t>
+      </w:r>
+      <w:r>
+        <w:rPr>
+          <w:rFonts w:ascii="Times New Roman" w:hAnsi="Times New Roman"/>
+          <w:b w:val="0"/>
+          <w:color w:val="000000"/>
+          <w:sz w:val="22"/>
+        </w:rPr>
+        <w:t>Đặt câu hỏi theo checklist đã chuẩn bị (mục 3.8.1.2), ưu tiên hỏi mở trước, hỏi số liệu cụ thể sau.</w:t>
+      </w:r>
+    </w:p>
+    <w:p>
+      <w:pPr>
+        <w:pStyle w:val="ListParagraph"/>
+        <w:spacing w:before="20" w:after="40"/>
+      </w:pPr>
+      <w:r>
+        <w:rPr>
+          <w:rFonts w:ascii="Times New Roman" w:hAnsi="Times New Roman"/>
+          <w:b/>
+          <w:color w:val="000000"/>
+          <w:sz w:val="22"/>
+        </w:rPr>
+        <w:t xml:space="preserve">• </w:t>
+      </w:r>
+      <w:r>
+        <w:rPr>
+          <w:rFonts w:ascii="Times New Roman" w:hAnsi="Times New Roman"/>
+          <w:b w:val="0"/>
+          <w:color w:val="000000"/>
+          <w:sz w:val="22"/>
+        </w:rPr>
+        <w:t>Xin phép quan sát thực tế tại bưu cục, kho hàng hoàn và bộ phận CSKH (kèm ghi hình nếu cần).</w:t>
+      </w:r>
+    </w:p>
+    <w:p>
+      <w:pPr>
+        <w:pStyle w:val="ListParagraph"/>
+        <w:spacing w:before="20" w:after="40"/>
+      </w:pPr>
+      <w:r>
+        <w:rPr>
+          <w:rFonts w:ascii="Times New Roman" w:hAnsi="Times New Roman"/>
+          <w:b/>
+          <w:color w:val="000000"/>
+          <w:sz w:val="22"/>
+        </w:rPr>
+        <w:t xml:space="preserve">• </w:t>
+      </w:r>
+      <w:r>
+        <w:rPr>
+          <w:rFonts w:ascii="Times New Roman" w:hAnsi="Times New Roman"/>
+          <w:b w:val="0"/>
+          <w:color w:val="000000"/>
+          <w:sz w:val="22"/>
+        </w:rPr>
+        <w:t>Giới thiệu mục đích khảo sát, cam kết thông tin chỉ phục vụ phân tích và cải tiến quy trình.</w:t>
+      </w:r>
+    </w:p>
+    <w:p>
+      <w:pPr>
+        <w:spacing w:before="80" w:after="80"/>
+        <w:jc w:val="left"/>
+      </w:pPr>
+      <w:r>
+        <w:rPr>
+          <w:rFonts w:ascii="Times New Roman" w:hAnsi="Times New Roman"/>
+          <w:b/>
+          <w:i w:val="0"/>
+          <w:color w:val="000000"/>
+          <w:sz w:val="22"/>
+        </w:rPr>
+        <w:t>Kịch bản phỏng vấn / khảo sát hiện trường:</w:t>
+      </w:r>
+    </w:p>
+    <w:tbl>
+      <w:tblPr>
+        <w:tblW w:type="auto" w:w="0"/>
+        <w:jc w:val="center"/>
+        <w:tblLook w:firstColumn="1" w:firstRow="1" w:lastColumn="0" w:lastRow="0" w:noHBand="0" w:noVBand="1" w:val="04A0"/>
+      </w:tblPr>
+      <w:tblGrid>
+        <w:gridCol w:w="4680"/>
+        <w:gridCol w:w="4680"/>
+      </w:tblGrid>
+      <w:tr>
+        <w:tc>
+          <w:tcPr>
+            <w:tcW w:type="dxa" w:w="2880"/>
+            <w:shd w:fill="333333"/>
+          </w:tcPr>
+          <w:p>
+            <w:pPr>
+              <w:spacing w:before="60" w:after="60"/>
+              <w:jc w:val="center"/>
+            </w:pPr>
+            <w:r>
+              <w:rPr>
+                <w:rFonts w:ascii="Times New Roman" w:hAnsi="Times New Roman"/>
+                <w:b/>
+                <w:color w:val="FFFFFF"/>
+                <w:sz w:val="22"/>
+              </w:rPr>
+              <w:t>Nội dung</w:t>
+            </w:r>
+          </w:p>
+        </w:tc>
+        <w:tc>
+          <w:tcPr>
+            <w:tcW w:type="dxa" w:w="6480"/>
+            <w:shd w:fill="333333"/>
+          </w:tcPr>
+          <w:p>
+            <w:pPr>
+              <w:spacing w:before="60" w:after="60"/>
+              <w:jc w:val="center"/>
+            </w:pPr>
+            <w:r>
+              <w:rPr>
+                <w:rFonts w:ascii="Times New Roman" w:hAnsi="Times New Roman"/>
+                <w:b/>
+                <w:color w:val="FFFFFF"/>
+                <w:sz w:val="22"/>
+              </w:rPr>
+              <w:t>Chi tiết</w:t>
+            </w:r>
+          </w:p>
+        </w:tc>
+      </w:tr>
+      <w:tr>
+        <w:tc>
+          <w:tcPr>
+            <w:tcW w:type="dxa" w:w="2880"/>
+            <w:shd w:fill="FFFFFF"/>
+          </w:tcPr>
+          <w:p>
+            <w:pPr>
+              <w:spacing w:before="40" w:after="40"/>
+            </w:pPr>
+            <w:r>
+              <w:rPr>
+                <w:rFonts w:ascii="Times New Roman" w:hAnsi="Times New Roman"/>
+                <w:color w:val="000000"/>
+                <w:sz w:val="22"/>
+              </w:rPr>
+              <w:t>Tiêu đề cuộc họp</w:t>
+            </w:r>
+          </w:p>
+        </w:tc>
+        <w:tc>
+          <w:tcPr>
+            <w:tcW w:type="dxa" w:w="6480"/>
+            <w:shd w:fill="FFFFFF"/>
+          </w:tcPr>
+          <w:p>
+            <w:pPr>
+              <w:spacing w:before="40" w:after="40"/>
+            </w:pPr>
+            <w:r>
+              <w:rPr>
+                <w:rFonts w:ascii="Times New Roman" w:hAnsi="Times New Roman"/>
+                <w:color w:val="000000"/>
+                <w:sz w:val="22"/>
+              </w:rPr>
+              <w:t>[Tên cuộc họp]</w:t>
+            </w:r>
+          </w:p>
+        </w:tc>
+      </w:tr>
+      <w:tr>
+        <w:tc>
+          <w:tcPr>
+            <w:tcW w:type="dxa" w:w="2880"/>
+            <w:shd w:fill="F5F5F5"/>
+          </w:tcPr>
+          <w:p>
+            <w:pPr>
+              <w:spacing w:before="40" w:after="40"/>
+            </w:pPr>
+            <w:r>
+              <w:rPr>
+                <w:rFonts w:ascii="Times New Roman" w:hAnsi="Times New Roman"/>
+                <w:color w:val="000000"/>
+                <w:sz w:val="22"/>
+              </w:rPr>
+              <w:t>Ngày/Giờ</w:t>
+            </w:r>
+          </w:p>
+        </w:tc>
+        <w:tc>
+          <w:tcPr>
+            <w:tcW w:type="dxa" w:w="6480"/>
+            <w:shd w:fill="F5F5F5"/>
+          </w:tcPr>
+          <w:p>
+            <w:pPr>
+              <w:spacing w:before="40" w:after="40"/>
+            </w:pPr>
+            <w:r>
+              <w:rPr>
+                <w:rFonts w:ascii="Times New Roman" w:hAnsi="Times New Roman"/>
+                <w:color w:val="000000"/>
+                <w:sz w:val="22"/>
+              </w:rPr>
+              <w:t>[Ngày/Tháng/Năm - Giờ bắt đầu - Giờ kết thúc]</w:t>
+            </w:r>
+          </w:p>
+        </w:tc>
+      </w:tr>
+      <w:tr>
+        <w:tc>
+          <w:tcPr>
+            <w:tcW w:type="dxa" w:w="2880"/>
+            <w:shd w:fill="FFFFFF"/>
+          </w:tcPr>
+          <w:p>
+            <w:pPr>
+              <w:spacing w:before="40" w:after="40"/>
+            </w:pPr>
+            <w:r>
+              <w:rPr>
+                <w:rFonts w:ascii="Times New Roman" w:hAnsi="Times New Roman"/>
+                <w:color w:val="000000"/>
+                <w:sz w:val="22"/>
+              </w:rPr>
+              <w:t>Người chủ trì</w:t>
+            </w:r>
+          </w:p>
+        </w:tc>
+        <w:tc>
+          <w:tcPr>
+            <w:tcW w:type="dxa" w:w="6480"/>
+            <w:shd w:fill="FFFFFF"/>
+          </w:tcPr>
+          <w:p>
+            <w:pPr>
+              <w:spacing w:before="40" w:after="40"/>
+            </w:pPr>
+            <w:r>
+              <w:rPr>
+                <w:rFonts w:ascii="Times New Roman" w:hAnsi="Times New Roman"/>
+                <w:color w:val="000000"/>
+                <w:sz w:val="22"/>
+              </w:rPr>
+              <w:t>[Họ tên - Chức vụ]</w:t>
+            </w:r>
+          </w:p>
+        </w:tc>
+      </w:tr>
+      <w:tr>
+        <w:tc>
+          <w:tcPr>
+            <w:tcW w:type="dxa" w:w="2880"/>
+            <w:shd w:fill="F5F5F5"/>
+          </w:tcPr>
+          <w:p>
+            <w:pPr>
+              <w:spacing w:before="40" w:after="40"/>
+            </w:pPr>
+            <w:r>
+              <w:rPr>
+                <w:rFonts w:ascii="Times New Roman" w:hAnsi="Times New Roman"/>
+                <w:color w:val="000000"/>
+                <w:sz w:val="22"/>
+              </w:rPr>
+              <w:t>Thành phần tham dự</w:t>
+            </w:r>
+          </w:p>
+        </w:tc>
+        <w:tc>
+          <w:tcPr>
+            <w:tcW w:type="dxa" w:w="6480"/>
+            <w:shd w:fill="F5F5F5"/>
+          </w:tcPr>
+          <w:p>
+            <w:pPr>
+              <w:spacing w:before="40" w:after="40"/>
+            </w:pPr>
+            <w:r>
+              <w:rPr>
+                <w:rFonts w:ascii="Times New Roman" w:hAnsi="Times New Roman"/>
+                <w:color w:val="000000"/>
+                <w:sz w:val="22"/>
+              </w:rPr>
+              <w:t>[Danh sách tên - Chức vụ]</w:t>
+            </w:r>
+          </w:p>
+        </w:tc>
+      </w:tr>
+      <w:tr>
+        <w:tc>
+          <w:tcPr>
+            <w:tcW w:type="dxa" w:w="2880"/>
+            <w:shd w:fill="FFFFFF"/>
+          </w:tcPr>
+          <w:p>
+            <w:pPr>
+              <w:spacing w:before="40" w:after="40"/>
+            </w:pPr>
+            <w:r>
+              <w:rPr>
+                <w:rFonts w:ascii="Times New Roman" w:hAnsi="Times New Roman"/>
+                <w:color w:val="000000"/>
+                <w:sz w:val="22"/>
+              </w:rPr>
+              <w:t>Nội dung thảo luận</w:t>
+            </w:r>
+          </w:p>
+        </w:tc>
+        <w:tc>
+          <w:tcPr>
+            <w:tcW w:type="dxa" w:w="6480"/>
+            <w:shd w:fill="FFFFFF"/>
+          </w:tcPr>
+          <w:p>
+            <w:pPr>
+              <w:spacing w:before="40" w:after="40"/>
+            </w:pPr>
+            <w:r>
+              <w:rPr>
+                <w:rFonts w:ascii="Times New Roman" w:hAnsi="Times New Roman"/>
+                <w:color w:val="000000"/>
+                <w:sz w:val="22"/>
+              </w:rPr>
+              <w:t>[Mô tả nội dung chính]</w:t>
+            </w:r>
+          </w:p>
+        </w:tc>
+      </w:tr>
+      <w:tr>
+        <w:tc>
+          <w:tcPr>
+            <w:tcW w:type="dxa" w:w="2880"/>
+            <w:shd w:fill="F5F5F5"/>
+          </w:tcPr>
+          <w:p>
+            <w:pPr>
+              <w:spacing w:before="40" w:after="40"/>
+            </w:pPr>
+            <w:r>
+              <w:rPr>
+                <w:rFonts w:ascii="Times New Roman" w:hAnsi="Times New Roman"/>
+                <w:color w:val="000000"/>
+                <w:sz w:val="22"/>
+              </w:rPr>
+              <w:t>Quyết định / Kết luận</w:t>
+            </w:r>
+          </w:p>
+        </w:tc>
+        <w:tc>
+          <w:tcPr>
+            <w:tcW w:type="dxa" w:w="6480"/>
+            <w:shd w:fill="F5F5F5"/>
+          </w:tcPr>
+          <w:p>
+            <w:pPr>
+              <w:spacing w:before="40" w:after="40"/>
+            </w:pPr>
+            <w:r>
+              <w:rPr>
+                <w:rFonts w:ascii="Times New Roman" w:hAnsi="Times New Roman"/>
+                <w:color w:val="000000"/>
+                <w:sz w:val="22"/>
+              </w:rPr>
+              <w:t>[Liệt kê các quyết định đã thống nhất]</w:t>
+            </w:r>
+          </w:p>
+        </w:tc>
+      </w:tr>
+      <w:tr>
+        <w:tc>
+          <w:tcPr>
+            <w:tcW w:type="dxa" w:w="2880"/>
+            <w:shd w:fill="FFFFFF"/>
+          </w:tcPr>
+          <w:p>
+            <w:pPr>
+              <w:spacing w:before="40" w:after="40"/>
+            </w:pPr>
+            <w:r>
+              <w:rPr>
+                <w:rFonts w:ascii="Times New Roman" w:hAnsi="Times New Roman"/>
+                <w:color w:val="000000"/>
+                <w:sz w:val="22"/>
+              </w:rPr>
+              <w:t>Hành động tiếp theo</w:t>
+            </w:r>
+          </w:p>
+        </w:tc>
+        <w:tc>
+          <w:tcPr>
+            <w:tcW w:type="dxa" w:w="6480"/>
+            <w:shd w:fill="FFFFFF"/>
+          </w:tcPr>
+          <w:p>
+            <w:pPr>
+              <w:spacing w:before="40" w:after="40"/>
+            </w:pPr>
+            <w:r>
+              <w:rPr>
+                <w:rFonts w:ascii="Times New Roman" w:hAnsi="Times New Roman"/>
+                <w:color w:val="000000"/>
+                <w:sz w:val="22"/>
+              </w:rPr>
+              <w:t>[Công việc - Người phụ trách - Deadline]</w:t>
+            </w:r>
+          </w:p>
+        </w:tc>
+      </w:tr>
+    </w:tbl>
+    <w:p>
+      <w:pPr>
+        <w:spacing w:before="40" w:after="80"/>
+        <w:jc w:val="left"/>
+      </w:pPr>
+      <w:r>
+        <w:rPr>
+          <w:rFonts w:ascii="Times New Roman" w:hAnsi="Times New Roman"/>
+          <w:b w:val="0"/>
+          <w:i w:val="0"/>
+          <w:color w:val="000000"/>
+          <w:sz w:val="22"/>
+        </w:rPr>
+        <w:t>Mục đích: ghi nhận nội dung, quyết định và phân công hành động sau các cuộc họp giao ban ca, họp rà soát khiếu nại hoặc họp đối soát. Người sử dụng: quản lý CSKH, trưởng bưu cục, trưởng ca kho.</w:t>
+      </w:r>
+    </w:p>
+    <w:p>
+      <w:pPr>
+        <w:spacing w:before="40" w:after="80"/>
+        <w:jc w:val="left"/>
+      </w:pPr>
+      <w:r>
+        <w:rPr>
+          <w:rFonts w:ascii="Times New Roman" w:hAnsi="Times New Roman"/>
+          <w:b/>
+          <w:i w:val="0"/>
+          <w:color w:val="000000"/>
+          <w:sz w:val="22"/>
+        </w:rPr>
+        <w:t>Biểu mẫu 2: Biểu mẫu cuộc họp</w:t>
+      </w:r>
+    </w:p>
+    <w:tbl>
+      <w:tblPr>
+        <w:tblW w:type="auto" w:w="0"/>
+        <w:jc w:val="center"/>
+        <w:tblLook w:firstColumn="1" w:firstRow="1" w:lastColumn="0" w:lastRow="0" w:noHBand="0" w:noVBand="1" w:val="04A0"/>
+      </w:tblPr>
+      <w:tblGrid>
+        <w:gridCol w:w="4680"/>
+        <w:gridCol w:w="4680"/>
+      </w:tblGrid>
+      <w:tr>
+        <w:tc>
+          <w:tcPr>
+            <w:tcW w:type="dxa" w:w="2880"/>
+            <w:shd w:fill="333333"/>
+          </w:tcPr>
+          <w:p>
+            <w:pPr>
+              <w:spacing w:before="60" w:after="60"/>
+              <w:jc w:val="center"/>
+            </w:pPr>
+            <w:r>
+              <w:rPr>
+                <w:rFonts w:ascii="Times New Roman" w:hAnsi="Times New Roman"/>
+                <w:b/>
+                <w:color w:val="FFFFFF"/>
+                <w:sz w:val="22"/>
+              </w:rPr>
+              <w:t>Nội dung</w:t>
+            </w:r>
+          </w:p>
+        </w:tc>
+        <w:tc>
+          <w:tcPr>
+            <w:tcW w:type="dxa" w:w="6480"/>
+            <w:shd w:fill="333333"/>
+          </w:tcPr>
+          <w:p>
+            <w:pPr>
+              <w:spacing w:before="60" w:after="60"/>
+              <w:jc w:val="center"/>
+            </w:pPr>
+            <w:r>
+              <w:rPr>
+                <w:rFonts w:ascii="Times New Roman" w:hAnsi="Times New Roman"/>
+                <w:b/>
+                <w:color w:val="FFFFFF"/>
+                <w:sz w:val="22"/>
+              </w:rPr>
+              <w:t>Chi tiết</w:t>
+            </w:r>
+          </w:p>
+        </w:tc>
+      </w:tr>
+      <w:tr>
+        <w:tc>
+          <w:tcPr>
+            <w:tcW w:type="dxa" w:w="2880"/>
+            <w:shd w:fill="FFFFFF"/>
+          </w:tcPr>
+          <w:p>
+            <w:pPr>
+              <w:spacing w:before="40" w:after="40"/>
+            </w:pPr>
+            <w:r>
+              <w:rPr>
+                <w:rFonts w:ascii="Times New Roman" w:hAnsi="Times New Roman"/>
+                <w:color w:val="000000"/>
+                <w:sz w:val="22"/>
+              </w:rPr>
+              <w:t>Tên workshop</w:t>
+            </w:r>
+          </w:p>
+        </w:tc>
+        <w:tc>
+          <w:tcPr>
+            <w:tcW w:type="dxa" w:w="6480"/>
+            <w:shd w:fill="FFFFFF"/>
+          </w:tcPr>
+          <w:p>
+            <w:pPr>
+              <w:spacing w:before="40" w:after="40"/>
+            </w:pPr>
+            <w:r>
+              <w:rPr>
+                <w:rFonts w:ascii="Times New Roman" w:hAnsi="Times New Roman"/>
+                <w:color w:val="000000"/>
+                <w:sz w:val="22"/>
+              </w:rPr>
+              <w:t>Thu thập thông tin quy trình Quản lý hoàn trả hàng &amp; CSKH</w:t>
+            </w:r>
+          </w:p>
+        </w:tc>
+      </w:tr>
+      <w:tr>
+        <w:tc>
+          <w:tcPr>
+            <w:tcW w:type="dxa" w:w="2880"/>
+            <w:shd w:fill="F5F5F5"/>
+          </w:tcPr>
+          <w:p>
+            <w:pPr>
+              <w:spacing w:before="40" w:after="40"/>
+            </w:pPr>
+            <w:r>
+              <w:rPr>
+                <w:rFonts w:ascii="Times New Roman" w:hAnsi="Times New Roman"/>
+                <w:color w:val="000000"/>
+                <w:sz w:val="22"/>
+              </w:rPr>
+              <w:t>Ngày thực hiện</w:t>
+            </w:r>
+          </w:p>
+        </w:tc>
+        <w:tc>
+          <w:tcPr>
+            <w:tcW w:type="dxa" w:w="6480"/>
+            <w:shd w:fill="F5F5F5"/>
+          </w:tcPr>
+          <w:p>
+            <w:pPr>
+              <w:spacing w:before="40" w:after="40"/>
+            </w:pPr>
+            <w:r>
+              <w:rPr>
+                <w:rFonts w:ascii="Times New Roman" w:hAnsi="Times New Roman"/>
+                <w:color w:val="000000"/>
+                <w:sz w:val="22"/>
+              </w:rPr>
+              <w:t>[Ngày/Tháng/Năm]</w:t>
+            </w:r>
+          </w:p>
+        </w:tc>
+      </w:tr>
+      <w:tr>
+        <w:tc>
+          <w:tcPr>
+            <w:tcW w:type="dxa" w:w="2880"/>
+            <w:shd w:fill="FFFFFF"/>
+          </w:tcPr>
+          <w:p>
+            <w:pPr>
+              <w:spacing w:before="40" w:after="40"/>
+            </w:pPr>
+            <w:r>
+              <w:rPr>
+                <w:rFonts w:ascii="Times New Roman" w:hAnsi="Times New Roman"/>
+                <w:color w:val="000000"/>
+                <w:sz w:val="22"/>
+              </w:rPr>
+              <w:t>Địa điểm</w:t>
+            </w:r>
+          </w:p>
+        </w:tc>
+        <w:tc>
+          <w:tcPr>
+            <w:tcW w:type="dxa" w:w="6480"/>
+            <w:shd w:fill="FFFFFF"/>
+          </w:tcPr>
+          <w:p>
+            <w:pPr>
+              <w:spacing w:before="40" w:after="40"/>
+            </w:pPr>
+            <w:r>
+              <w:rPr>
+                <w:rFonts w:ascii="Times New Roman" w:hAnsi="Times New Roman"/>
+                <w:color w:val="000000"/>
+                <w:sz w:val="22"/>
+              </w:rPr>
+              <w:t>Phòng họp Viettel Post / Online</w:t>
+            </w:r>
+          </w:p>
+        </w:tc>
+      </w:tr>
+      <w:tr>
+        <w:tc>
+          <w:tcPr>
+            <w:tcW w:type="dxa" w:w="2880"/>
+            <w:shd w:fill="F5F5F5"/>
+          </w:tcPr>
+          <w:p>
+            <w:pPr>
+              <w:spacing w:before="40" w:after="40"/>
+            </w:pPr>
+            <w:r>
+              <w:rPr>
+                <w:rFonts w:ascii="Times New Roman" w:hAnsi="Times New Roman"/>
+                <w:color w:val="000000"/>
+                <w:sz w:val="22"/>
+              </w:rPr>
+              <w:t>Người chủ trì</w:t>
+            </w:r>
+          </w:p>
+        </w:tc>
+        <w:tc>
+          <w:tcPr>
+            <w:tcW w:type="dxa" w:w="6480"/>
+            <w:shd w:fill="F5F5F5"/>
+          </w:tcPr>
+          <w:p>
+            <w:pPr>
+              <w:spacing w:before="40" w:after="40"/>
+            </w:pPr>
+            <w:r>
+              <w:rPr>
+                <w:rFonts w:ascii="Times New Roman" w:hAnsi="Times New Roman"/>
+                <w:color w:val="000000"/>
+                <w:sz w:val="22"/>
+              </w:rPr>
+              <w:t>[Họ tên - Chức vụ]</w:t>
+            </w:r>
+          </w:p>
+        </w:tc>
+      </w:tr>
+      <w:tr>
+        <w:tc>
+          <w:tcPr>
+            <w:tcW w:type="dxa" w:w="2880"/>
+            <w:shd w:fill="FFFFFF"/>
+          </w:tcPr>
+          <w:p>
+            <w:pPr>
+              <w:spacing w:before="40" w:after="40"/>
+            </w:pPr>
+            <w:r>
+              <w:rPr>
+                <w:rFonts w:ascii="Times New Roman" w:hAnsi="Times New Roman"/>
+                <w:color w:val="000000"/>
+                <w:sz w:val="22"/>
+              </w:rPr>
+              <w:t>Thành phần tham dự</w:t>
+            </w:r>
+          </w:p>
+        </w:tc>
+        <w:tc>
+          <w:tcPr>
+            <w:tcW w:type="dxa" w:w="6480"/>
+            <w:shd w:fill="FFFFFF"/>
+          </w:tcPr>
+          <w:p>
+            <w:pPr>
+              <w:spacing w:before="40" w:after="40"/>
+            </w:pPr>
+            <w:r>
+              <w:rPr>
+                <w:rFonts w:ascii="Times New Roman" w:hAnsi="Times New Roman"/>
+                <w:color w:val="000000"/>
+                <w:sz w:val="22"/>
+              </w:rPr>
+              <w:t>Đại diện CSKH, Shipper, Bưu cục/Kho, Hệ thống CNTT</w:t>
+            </w:r>
+          </w:p>
+        </w:tc>
+      </w:tr>
+      <w:tr>
+        <w:tc>
+          <w:tcPr>
+            <w:tcW w:type="dxa" w:w="2880"/>
+            <w:shd w:fill="F5F5F5"/>
+          </w:tcPr>
+          <w:p>
+            <w:pPr>
+              <w:spacing w:before="40" w:after="40"/>
+            </w:pPr>
+            <w:r>
+              <w:rPr>
+                <w:rFonts w:ascii="Times New Roman" w:hAnsi="Times New Roman"/>
+                <w:color w:val="000000"/>
+                <w:sz w:val="22"/>
+              </w:rPr>
+              <w:t>Mục tiêu workshop</w:t>
+            </w:r>
+          </w:p>
+        </w:tc>
+        <w:tc>
+          <w:tcPr>
+            <w:tcW w:type="dxa" w:w="6480"/>
+            <w:shd w:fill="F5F5F5"/>
+          </w:tcPr>
+          <w:p>
+            <w:pPr>
+              <w:spacing w:before="40" w:after="40"/>
+            </w:pPr>
+            <w:r>
+              <w:rPr>
+                <w:rFonts w:ascii="Times New Roman" w:hAnsi="Times New Roman"/>
+                <w:color w:val="000000"/>
+                <w:sz w:val="22"/>
+              </w:rPr>
+              <w:t>Xác định các bước quy trình hiện tại, thời gian xử lý, điểm nghẽn và lãng phí</w:t>
+            </w:r>
+          </w:p>
+        </w:tc>
+      </w:tr>
+      <w:tr>
+        <w:tc>
+          <w:tcPr>
+            <w:tcW w:type="dxa" w:w="2880"/>
+            <w:shd w:fill="FFFFFF"/>
+          </w:tcPr>
+          <w:p>
+            <w:pPr>
+              <w:spacing w:before="40" w:after="40"/>
+            </w:pPr>
+            <w:r>
+              <w:rPr>
+                <w:rFonts w:ascii="Times New Roman" w:hAnsi="Times New Roman"/>
+                <w:color w:val="000000"/>
+                <w:sz w:val="22"/>
+              </w:rPr>
+              <w:t>Kết quả mong đợi</w:t>
+            </w:r>
+          </w:p>
+        </w:tc>
+        <w:tc>
+          <w:tcPr>
+            <w:tcW w:type="dxa" w:w="6480"/>
+            <w:shd w:fill="FFFFFF"/>
+          </w:tcPr>
+          <w:p>
+            <w:pPr>
+              <w:spacing w:before="40" w:after="40"/>
+            </w:pPr>
+            <w:r>
+              <w:rPr>
+                <w:rFonts w:ascii="Times New Roman" w:hAnsi="Times New Roman"/>
+                <w:color w:val="000000"/>
+                <w:sz w:val="22"/>
+              </w:rPr>
+              <w:t>Bản mô tả quy trình AS-IS, danh sách vấn đề và đề xuất cải tiến ban đầu</w:t>
+            </w:r>
+          </w:p>
+        </w:tc>
+      </w:tr>
+    </w:tbl>
+    <w:p>
+      <w:pPr>
+        <w:spacing w:before="40" w:after="80"/>
+        <w:jc w:val="left"/>
+      </w:pPr>
+      <w:r>
+        <w:rPr>
+          <w:rFonts w:ascii="Times New Roman" w:hAnsi="Times New Roman"/>
+          <w:b w:val="0"/>
+          <w:i w:val="0"/>
+          <w:color w:val="000000"/>
+          <w:sz w:val="22"/>
+        </w:rPr>
+        <w:t>Mục đích: thu thập thông tin thực tế từ các bộ phận liên quan (CSKH, Shipper, Kho) để xây dựng mô hình quy trình AS-IS. Người sử dụng: nhóm phân tích quy trình, quản lý vận hành hoàn trả &amp; CSKH.</w:t>
+      </w:r>
+    </w:p>
+    <w:p>
+      <w:pPr>
+        <w:spacing w:before="40" w:after="80"/>
+        <w:jc w:val="left"/>
+      </w:pPr>
+      <w:r>
+        <w:rPr>
+          <w:rFonts w:ascii="Times New Roman" w:hAnsi="Times New Roman"/>
+          <w:b/>
+          <w:i w:val="0"/>
+          <w:color w:val="000000"/>
+          <w:sz w:val="22"/>
+        </w:rPr>
+        <w:t>Biểu mẫu 1: Biểu mẫu workshop thu thập thông tin quy trình hoàn trả</w:t>
+      </w:r>
+    </w:p>
+    <w:p>
+      <w:pPr>
+        <w:spacing w:before="120" w:after="60"/>
+        <w:jc w:val="left"/>
+      </w:pPr>
+      <w:r>
+        <w:rPr>
+          <w:rFonts w:ascii="Times New Roman" w:hAnsi="Times New Roman"/>
+          <w:b/>
+          <w:i w:val="0"/>
+          <w:color w:val="000000"/>
+          <w:sz w:val="26"/>
+        </w:rPr>
+        <w:t>3.8.1.1.5. Biểu mẫu</w:t>
+      </w:r>
+    </w:p>
+    <w:tbl>
+      <w:tblPr>
+        <w:tblW w:type="auto" w:w="0"/>
+        <w:jc w:val="center"/>
+        <w:tblLook w:firstColumn="1" w:firstRow="1" w:lastColumn="0" w:lastRow="0" w:noHBand="0" w:noVBand="1" w:val="04A0"/>
+      </w:tblPr>
+      <w:tblGrid>
+        <w:gridCol w:w="4680"/>
+        <w:gridCol w:w="4680"/>
+      </w:tblGrid>
+      <w:tr>
+        <w:tc>
+          <w:tcPr>
+            <w:tcW w:type="dxa" w:w="2880"/>
+            <w:shd w:fill="333333"/>
+          </w:tcPr>
+          <w:p>
+            <w:pPr>
+              <w:spacing w:before="60" w:after="60"/>
+              <w:jc w:val="center"/>
+            </w:pPr>
+            <w:r>
+              <w:rPr>
+                <w:rFonts w:ascii="Times New Roman" w:hAnsi="Times New Roman"/>
+                <w:b/>
+                <w:color w:val="FFFFFF"/>
+                <w:sz w:val="22"/>
+              </w:rPr>
+              <w:t>Thuật ngữ / Viết tắt</w:t>
+            </w:r>
+          </w:p>
+        </w:tc>
+        <w:tc>
+          <w:tcPr>
+            <w:tcW w:type="dxa" w:w="6480"/>
+            <w:shd w:fill="333333"/>
+          </w:tcPr>
+          <w:p>
+            <w:pPr>
+              <w:spacing w:before="60" w:after="60"/>
+              <w:jc w:val="center"/>
+            </w:pPr>
+            <w:r>
+              <w:rPr>
+                <w:rFonts w:ascii="Times New Roman" w:hAnsi="Times New Roman"/>
+                <w:b/>
+                <w:color w:val="FFFFFF"/>
+                <w:sz w:val="22"/>
+              </w:rPr>
+              <w:t>Giải thích</w:t>
+            </w:r>
+          </w:p>
+        </w:tc>
+      </w:tr>
+      <w:tr>
+        <w:tc>
+          <w:tcPr>
+            <w:tcW w:type="dxa" w:w="2880"/>
+            <w:shd w:fill="FFFFFF"/>
+          </w:tcPr>
+          <w:p>
+            <w:pPr>
+              <w:spacing w:before="40" w:after="40"/>
+            </w:pPr>
+            <w:r>
+              <w:rPr>
+                <w:rFonts w:ascii="Times New Roman" w:hAnsi="Times New Roman"/>
+                <w:color w:val="000000"/>
+                <w:sz w:val="22"/>
+              </w:rPr>
+              <w:t>CSKH</w:t>
+            </w:r>
+          </w:p>
+        </w:tc>
+        <w:tc>
+          <w:tcPr>
+            <w:tcW w:type="dxa" w:w="6480"/>
+            <w:shd w:fill="FFFFFF"/>
+          </w:tcPr>
+          <w:p>
+            <w:pPr>
+              <w:spacing w:before="40" w:after="40"/>
+            </w:pPr>
+            <w:r>
+              <w:rPr>
+                <w:rFonts w:ascii="Times New Roman" w:hAnsi="Times New Roman"/>
+                <w:color w:val="000000"/>
+                <w:sz w:val="22"/>
+              </w:rPr>
+              <w:t>Chăm sóc khách hàng - Bộ phận tiếp nhận và xử lý yêu cầu hoàn trả, khiếu nại</w:t>
+            </w:r>
+          </w:p>
+        </w:tc>
+      </w:tr>
+      <w:tr>
+        <w:tc>
+          <w:tcPr>
+            <w:tcW w:type="dxa" w:w="2880"/>
+            <w:shd w:fill="F5F5F5"/>
+          </w:tcPr>
+          <w:p>
+            <w:pPr>
+              <w:spacing w:before="40" w:after="40"/>
+            </w:pPr>
+            <w:r>
+              <w:rPr>
+                <w:rFonts w:ascii="Times New Roman" w:hAnsi="Times New Roman"/>
+                <w:color w:val="000000"/>
+                <w:sz w:val="22"/>
+              </w:rPr>
+              <w:t>CRM</w:t>
+            </w:r>
+          </w:p>
+        </w:tc>
+        <w:tc>
+          <w:tcPr>
+            <w:tcW w:type="dxa" w:w="6480"/>
+            <w:shd w:fill="F5F5F5"/>
+          </w:tcPr>
+          <w:p>
+            <w:pPr>
+              <w:spacing w:before="40" w:after="40"/>
+            </w:pPr>
+            <w:r>
+              <w:rPr>
+                <w:rFonts w:ascii="Times New Roman" w:hAnsi="Times New Roman"/>
+                <w:color w:val="000000"/>
+                <w:sz w:val="22"/>
+              </w:rPr>
+              <w:t>Customer Relationship Management - Hệ thống quản lý quan hệ khách hàng</w:t>
+            </w:r>
+          </w:p>
+        </w:tc>
+      </w:tr>
+      <w:tr>
+        <w:tc>
+          <w:tcPr>
+            <w:tcW w:type="dxa" w:w="2880"/>
+            <w:shd w:fill="FFFFFF"/>
+          </w:tcPr>
+          <w:p>
+            <w:pPr>
+              <w:spacing w:before="40" w:after="40"/>
+            </w:pPr>
+            <w:r>
+              <w:rPr>
+                <w:rFonts w:ascii="Times New Roman" w:hAnsi="Times New Roman"/>
+                <w:color w:val="000000"/>
+                <w:sz w:val="22"/>
+              </w:rPr>
+              <w:t>WMS</w:t>
+            </w:r>
+          </w:p>
+        </w:tc>
+        <w:tc>
+          <w:tcPr>
+            <w:tcW w:type="dxa" w:w="6480"/>
+            <w:shd w:fill="FFFFFF"/>
+          </w:tcPr>
+          <w:p>
+            <w:pPr>
+              <w:spacing w:before="40" w:after="40"/>
+            </w:pPr>
+            <w:r>
+              <w:rPr>
+                <w:rFonts w:ascii="Times New Roman" w:hAnsi="Times New Roman"/>
+                <w:color w:val="000000"/>
+                <w:sz w:val="22"/>
+              </w:rPr>
+              <w:t>Warehouse Management System - Hệ thống quản lý kho</w:t>
+            </w:r>
+          </w:p>
+        </w:tc>
+      </w:tr>
+      <w:tr>
+        <w:tc>
+          <w:tcPr>
+            <w:tcW w:type="dxa" w:w="2880"/>
+            <w:shd w:fill="F5F5F5"/>
+          </w:tcPr>
+          <w:p>
+            <w:pPr>
+              <w:spacing w:before="40" w:after="40"/>
+            </w:pPr>
+            <w:r>
+              <w:rPr>
+                <w:rFonts w:ascii="Times New Roman" w:hAnsi="Times New Roman"/>
+                <w:color w:val="000000"/>
+                <w:sz w:val="22"/>
+              </w:rPr>
+              <w:t>TMS</w:t>
+            </w:r>
+          </w:p>
+        </w:tc>
+        <w:tc>
+          <w:tcPr>
+            <w:tcW w:type="dxa" w:w="6480"/>
+            <w:shd w:fill="F5F5F5"/>
+          </w:tcPr>
+          <w:p>
+            <w:pPr>
+              <w:spacing w:before="40" w:after="40"/>
+            </w:pPr>
+            <w:r>
+              <w:rPr>
+                <w:rFonts w:ascii="Times New Roman" w:hAnsi="Times New Roman"/>
+                <w:color w:val="000000"/>
+                <w:sz w:val="22"/>
+              </w:rPr>
+              <w:t>Transportation Management System - Hệ thống quản lý vận chuyển</w:t>
+            </w:r>
+          </w:p>
+        </w:tc>
+      </w:tr>
+      <w:tr>
+        <w:tc>
+          <w:tcPr>
+            <w:tcW w:type="dxa" w:w="2880"/>
+            <w:shd w:fill="FFFFFF"/>
+          </w:tcPr>
+          <w:p>
+            <w:pPr>
+              <w:spacing w:before="40" w:after="40"/>
+            </w:pPr>
+            <w:r>
+              <w:rPr>
+                <w:rFonts w:ascii="Times New Roman" w:hAnsi="Times New Roman"/>
+                <w:color w:val="000000"/>
+                <w:sz w:val="22"/>
+              </w:rPr>
+              <w:t>SLA</w:t>
+            </w:r>
+          </w:p>
+        </w:tc>
+        <w:tc>
+          <w:tcPr>
+            <w:tcW w:type="dxa" w:w="6480"/>
+            <w:shd w:fill="FFFFFF"/>
+          </w:tcPr>
+          <w:p>
+            <w:pPr>
+              <w:spacing w:before="40" w:after="40"/>
+            </w:pPr>
+            <w:r>
+              <w:rPr>
+                <w:rFonts w:ascii="Times New Roman" w:hAnsi="Times New Roman"/>
+                <w:color w:val="000000"/>
+                <w:sz w:val="22"/>
+              </w:rPr>
+              <w:t>Service Level Agreement - Cam kết mức dịch vụ (thời gian xử lý tối đa)</w:t>
+            </w:r>
+          </w:p>
+        </w:tc>
+      </w:tr>
+      <w:tr>
+        <w:tc>
+          <w:tcPr>
+            <w:tcW w:type="dxa" w:w="2880"/>
+            <w:shd w:fill="F5F5F5"/>
+          </w:tcPr>
+          <w:p>
+            <w:pPr>
+              <w:spacing w:before="40" w:after="40"/>
+            </w:pPr>
+            <w:r>
+              <w:rPr>
+                <w:rFonts w:ascii="Times New Roman" w:hAnsi="Times New Roman"/>
+                <w:color w:val="000000"/>
+                <w:sz w:val="22"/>
+              </w:rPr>
+              <w:t>VA</w:t>
+            </w:r>
+          </w:p>
+        </w:tc>
+        <w:tc>
+          <w:tcPr>
+            <w:tcW w:type="dxa" w:w="6480"/>
+            <w:shd w:fill="F5F5F5"/>
+          </w:tcPr>
+          <w:p>
+            <w:pPr>
+              <w:spacing w:before="40" w:after="40"/>
+            </w:pPr>
+            <w:r>
+              <w:rPr>
+                <w:rFonts w:ascii="Times New Roman" w:hAnsi="Times New Roman"/>
+                <w:color w:val="000000"/>
+                <w:sz w:val="22"/>
+              </w:rPr>
+              <w:t>Value-Added - Hoạt động tạo giá trị trực tiếp cho khách hàng</w:t>
+            </w:r>
+          </w:p>
+        </w:tc>
+      </w:tr>
+      <w:tr>
+        <w:tc>
+          <w:tcPr>
+            <w:tcW w:type="dxa" w:w="2880"/>
+            <w:shd w:fill="FFFFFF"/>
+          </w:tcPr>
+          <w:p>
+            <w:pPr>
+              <w:spacing w:before="40" w:after="40"/>
+            </w:pPr>
+            <w:r>
+              <w:rPr>
+                <w:rFonts w:ascii="Times New Roman" w:hAnsi="Times New Roman"/>
+                <w:color w:val="000000"/>
+                <w:sz w:val="22"/>
+              </w:rPr>
+              <w:t>BVA</w:t>
+            </w:r>
+          </w:p>
+        </w:tc>
+        <w:tc>
+          <w:tcPr>
+            <w:tcW w:type="dxa" w:w="6480"/>
+            <w:shd w:fill="FFFFFF"/>
+          </w:tcPr>
+          <w:p>
+            <w:pPr>
+              <w:spacing w:before="40" w:after="40"/>
+            </w:pPr>
+            <w:r>
+              <w:rPr>
+                <w:rFonts w:ascii="Times New Roman" w:hAnsi="Times New Roman"/>
+                <w:color w:val="000000"/>
+                <w:sz w:val="22"/>
+              </w:rPr>
+              <w:t>Business Value-Added - Hoạt động cần thiết cho vận hành/kiểm soát</w:t>
+            </w:r>
+          </w:p>
+        </w:tc>
+      </w:tr>
+      <w:tr>
+        <w:tc>
+          <w:tcPr>
+            <w:tcW w:type="dxa" w:w="2880"/>
+            <w:shd w:fill="F5F5F5"/>
+          </w:tcPr>
+          <w:p>
+            <w:pPr>
+              <w:spacing w:before="40" w:after="40"/>
+            </w:pPr>
+            <w:r>
+              <w:rPr>
+                <w:rFonts w:ascii="Times New Roman" w:hAnsi="Times New Roman"/>
+                <w:color w:val="000000"/>
+                <w:sz w:val="22"/>
+              </w:rPr>
+              <w:t>NVA</w:t>
+            </w:r>
+          </w:p>
+        </w:tc>
+        <w:tc>
+          <w:tcPr>
+            <w:tcW w:type="dxa" w:w="6480"/>
+            <w:shd w:fill="F5F5F5"/>
+          </w:tcPr>
+          <w:p>
+            <w:pPr>
+              <w:spacing w:before="40" w:after="40"/>
+            </w:pPr>
+            <w:r>
+              <w:rPr>
+                <w:rFonts w:ascii="Times New Roman" w:hAnsi="Times New Roman"/>
+                <w:color w:val="000000"/>
+                <w:sz w:val="22"/>
+              </w:rPr>
+              <w:t>Non-Value-Added - Hoạt động không tạo giá trị, cần loại bỏ hoặc cải tiến</w:t>
+            </w:r>
+          </w:p>
+        </w:tc>
+      </w:tr>
+      <w:tr>
+        <w:tc>
+          <w:tcPr>
+            <w:tcW w:type="dxa" w:w="2880"/>
+            <w:shd w:fill="FFFFFF"/>
+          </w:tcPr>
+          <w:p>
+            <w:pPr>
+              <w:spacing w:before="40" w:after="40"/>
+            </w:pPr>
+            <w:r>
+              <w:rPr>
+                <w:rFonts w:ascii="Times New Roman" w:hAnsi="Times New Roman"/>
+                <w:color w:val="000000"/>
+                <w:sz w:val="22"/>
+              </w:rPr>
+              <w:t>CTE</w:t>
+            </w:r>
+          </w:p>
+        </w:tc>
+        <w:tc>
+          <w:tcPr>
+            <w:tcW w:type="dxa" w:w="6480"/>
+            <w:shd w:fill="FFFFFF"/>
+          </w:tcPr>
+          <w:p>
+            <w:pPr>
+              <w:spacing w:before="40" w:after="40"/>
+            </w:pPr>
+            <w:r>
+              <w:rPr>
+                <w:rFonts w:ascii="Times New Roman" w:hAnsi="Times New Roman"/>
+                <w:color w:val="000000"/>
+                <w:sz w:val="22"/>
+              </w:rPr>
+              <w:t>Cycle Time Efficiency - Hiệu suất thời gian chu kỳ = T_proc / T_cycle</w:t>
+            </w:r>
+          </w:p>
+        </w:tc>
+      </w:tr>
+      <w:tr>
+        <w:tc>
+          <w:tcPr>
+            <w:tcW w:type="dxa" w:w="2880"/>
+            <w:shd w:fill="F5F5F5"/>
+          </w:tcPr>
+          <w:p>
+            <w:pPr>
+              <w:spacing w:before="40" w:after="40"/>
+            </w:pPr>
+            <w:r>
+              <w:rPr>
+                <w:rFonts w:ascii="Times New Roman" w:hAnsi="Times New Roman"/>
+                <w:color w:val="000000"/>
+                <w:sz w:val="22"/>
+              </w:rPr>
+              <w:t>T_proc</w:t>
+            </w:r>
+          </w:p>
+        </w:tc>
+        <w:tc>
+          <w:tcPr>
+            <w:tcW w:type="dxa" w:w="6480"/>
+            <w:shd w:fill="F5F5F5"/>
+          </w:tcPr>
+          <w:p>
+            <w:pPr>
+              <w:spacing w:before="40" w:after="40"/>
+            </w:pPr>
+            <w:r>
+              <w:rPr>
+                <w:rFonts w:ascii="Times New Roman" w:hAnsi="Times New Roman"/>
+                <w:color w:val="000000"/>
+                <w:sz w:val="22"/>
+              </w:rPr>
+              <w:t>Processing Time - Thời gian xử lý thực tế (thao tác trực tiếp)</w:t>
+            </w:r>
+          </w:p>
+        </w:tc>
+      </w:tr>
+      <w:tr>
+        <w:tc>
+          <w:tcPr>
+            <w:tcW w:type="dxa" w:w="2880"/>
+            <w:shd w:fill="FFFFFF"/>
+          </w:tcPr>
+          <w:p>
+            <w:pPr>
+              <w:spacing w:before="40" w:after="40"/>
+            </w:pPr>
+            <w:r>
+              <w:rPr>
+                <w:rFonts w:ascii="Times New Roman" w:hAnsi="Times New Roman"/>
+                <w:color w:val="000000"/>
+                <w:sz w:val="22"/>
+              </w:rPr>
+              <w:t>T_wait</w:t>
+            </w:r>
+          </w:p>
+        </w:tc>
+        <w:tc>
+          <w:tcPr>
+            <w:tcW w:type="dxa" w:w="6480"/>
+            <w:shd w:fill="FFFFFF"/>
+          </w:tcPr>
+          <w:p>
+            <w:pPr>
+              <w:spacing w:before="40" w:after="40"/>
+            </w:pPr>
+            <w:r>
+              <w:rPr>
+                <w:rFonts w:ascii="Times New Roman" w:hAnsi="Times New Roman"/>
+                <w:color w:val="000000"/>
+                <w:sz w:val="22"/>
+              </w:rPr>
+              <w:t>Waiting Time - Thời gian chờ đợi (không có thao tác trực tiếp)</w:t>
+            </w:r>
+          </w:p>
+        </w:tc>
+      </w:tr>
+      <w:tr>
+        <w:tc>
+          <w:tcPr>
+            <w:tcW w:type="dxa" w:w="2880"/>
+            <w:shd w:fill="F5F5F5"/>
+          </w:tcPr>
+          <w:p>
+            <w:pPr>
+              <w:spacing w:before="40" w:after="40"/>
+            </w:pPr>
+            <w:r>
+              <w:rPr>
+                <w:rFonts w:ascii="Times New Roman" w:hAnsi="Times New Roman"/>
+                <w:color w:val="000000"/>
+                <w:sz w:val="22"/>
+              </w:rPr>
+              <w:t>T_cycle</w:t>
+            </w:r>
+          </w:p>
+        </w:tc>
+        <w:tc>
+          <w:tcPr>
+            <w:tcW w:type="dxa" w:w="6480"/>
+            <w:shd w:fill="F5F5F5"/>
+          </w:tcPr>
+          <w:p>
+            <w:pPr>
+              <w:spacing w:before="40" w:after="40"/>
+            </w:pPr>
+            <w:r>
+              <w:rPr>
+                <w:rFonts w:ascii="Times New Roman" w:hAnsi="Times New Roman"/>
+                <w:color w:val="000000"/>
+                <w:sz w:val="22"/>
+              </w:rPr>
+              <w:t>Cycle Time - Thời gian chu kỳ tổng = T_proc + T_wait</w:t>
+            </w:r>
+          </w:p>
+        </w:tc>
+      </w:tr>
+      <w:tr>
+        <w:tc>
+          <w:tcPr>
+            <w:tcW w:type="dxa" w:w="2880"/>
+            <w:shd w:fill="FFFFFF"/>
+          </w:tcPr>
+          <w:p>
+            <w:pPr>
+              <w:spacing w:before="40" w:after="40"/>
+            </w:pPr>
+            <w:r>
+              <w:rPr>
+                <w:rFonts w:ascii="Times New Roman" w:hAnsi="Times New Roman"/>
+                <w:color w:val="000000"/>
+                <w:sz w:val="22"/>
+              </w:rPr>
+              <w:t>Rework Loop</w:t>
+            </w:r>
+          </w:p>
+        </w:tc>
+        <w:tc>
+          <w:tcPr>
+            <w:tcW w:type="dxa" w:w="6480"/>
+            <w:shd w:fill="FFFFFF"/>
+          </w:tcPr>
+          <w:p>
+            <w:pPr>
+              <w:spacing w:before="40" w:after="40"/>
+            </w:pPr>
+            <w:r>
+              <w:rPr>
+                <w:rFonts w:ascii="Times New Roman" w:hAnsi="Times New Roman"/>
+                <w:color w:val="000000"/>
+                <w:sz w:val="22"/>
+              </w:rPr>
+              <w:t>Vòng lặp làm lại - Khách phải bổ sung chứng từ và quay lại bước kiểm tra</w:t>
+            </w:r>
+          </w:p>
+        </w:tc>
+      </w:tr>
+      <w:tr>
+        <w:tc>
+          <w:tcPr>
+            <w:tcW w:type="dxa" w:w="2880"/>
+            <w:shd w:fill="F5F5F5"/>
+          </w:tcPr>
+          <w:p>
+            <w:pPr>
+              <w:spacing w:before="40" w:after="40"/>
+            </w:pPr>
+            <w:r>
+              <w:rPr>
+                <w:rFonts w:ascii="Times New Roman" w:hAnsi="Times New Roman"/>
+                <w:color w:val="000000"/>
+                <w:sz w:val="22"/>
+              </w:rPr>
+              <w:t>Lean Muda</w:t>
+            </w:r>
+          </w:p>
+        </w:tc>
+        <w:tc>
+          <w:tcPr>
+            <w:tcW w:type="dxa" w:w="6480"/>
+            <w:shd w:fill="F5F5F5"/>
+          </w:tcPr>
+          <w:p>
+            <w:pPr>
+              <w:spacing w:before="40" w:after="40"/>
+            </w:pPr>
+            <w:r>
+              <w:rPr>
+                <w:rFonts w:ascii="Times New Roman" w:hAnsi="Times New Roman"/>
+                <w:color w:val="000000"/>
+                <w:sz w:val="22"/>
+              </w:rPr>
+              <w:t>7 loại lãng phí trong sản xuất tinh gọn (Lean Manufacturing)</w:t>
+            </w:r>
+          </w:p>
+        </w:tc>
+      </w:tr>
+      <w:tr>
+        <w:tc>
+          <w:tcPr>
+            <w:tcW w:type="dxa" w:w="2880"/>
+            <w:shd w:fill="FFFFFF"/>
+          </w:tcPr>
+          <w:p>
+            <w:pPr>
+              <w:spacing w:before="40" w:after="40"/>
+            </w:pPr>
+            <w:r>
+              <w:rPr>
+                <w:rFonts w:ascii="Times New Roman" w:hAnsi="Times New Roman"/>
+                <w:color w:val="000000"/>
+                <w:sz w:val="22"/>
+              </w:rPr>
+              <w:t>Fishbone / 6M</w:t>
+            </w:r>
+          </w:p>
+        </w:tc>
+        <w:tc>
+          <w:tcPr>
+            <w:tcW w:type="dxa" w:w="6480"/>
+            <w:shd w:fill="FFFFFF"/>
+          </w:tcPr>
+          <w:p>
+            <w:pPr>
+              <w:spacing w:before="40" w:after="40"/>
+            </w:pPr>
+            <w:r>
+              <w:rPr>
+                <w:rFonts w:ascii="Times New Roman" w:hAnsi="Times New Roman"/>
+                <w:color w:val="000000"/>
+                <w:sz w:val="22"/>
+              </w:rPr>
+              <w:t>Sơ đồ Ishikawa phân tích nguyên nhân theo 6 nhóm: Man, Machine, Material, Method, Measurement, Milieu</w:t>
+            </w:r>
+          </w:p>
+        </w:tc>
+      </w:tr>
+    </w:tbl>
+    <w:p>
+      <w:pPr>
+        <w:spacing w:before="120" w:after="60"/>
+        <w:jc w:val="left"/>
+      </w:pPr>
+      <w:r>
+        <w:rPr>
+          <w:rFonts w:ascii="Times New Roman" w:hAnsi="Times New Roman"/>
+          <w:b/>
+          <w:i w:val="0"/>
+          <w:color w:val="000000"/>
+          <w:sz w:val="26"/>
+        </w:rPr>
+        <w:t>3.8.1.1.4. Thuật ngữ và sổ tay</w:t>
+      </w:r>
+    </w:p>
+    <w:tbl>
+      <w:tblPr>
+        <w:tblW w:type="auto" w:w="0"/>
+        <w:jc w:val="center"/>
+        <w:tblLook w:firstColumn="1" w:firstRow="1" w:lastColumn="0" w:lastRow="0" w:noHBand="0" w:noVBand="1" w:val="04A0"/>
+      </w:tblPr>
+      <w:tblGrid>
+        <w:gridCol w:w="4680"/>
+        <w:gridCol w:w="4680"/>
+      </w:tblGrid>
+      <w:tr>
+        <w:tc>
+          <w:tcPr>
+            <w:tcW w:type="dxa" w:w="2160"/>
+            <w:shd w:fill="333333"/>
+          </w:tcPr>
+          <w:p>
+            <w:pPr>
+              <w:spacing w:before="60" w:after="60"/>
+              <w:jc w:val="center"/>
+            </w:pPr>
+            <w:r>
+              <w:rPr>
+                <w:rFonts w:ascii="Times New Roman" w:hAnsi="Times New Roman"/>
+                <w:b/>
+                <w:color w:val="FFFFFF"/>
+                <w:sz w:val="22"/>
+              </w:rPr>
+              <w:t>Ngày</w:t>
+            </w:r>
+          </w:p>
+        </w:tc>
+        <w:tc>
+          <w:tcPr>
+            <w:tcW w:type="dxa" w:w="7200"/>
+            <w:shd w:fill="333333"/>
+          </w:tcPr>
+          <w:p>
+            <w:pPr>
+              <w:spacing w:before="60" w:after="60"/>
+              <w:jc w:val="center"/>
+            </w:pPr>
+            <w:r>
+              <w:rPr>
+                <w:rFonts w:ascii="Times New Roman" w:hAnsi="Times New Roman"/>
+                <w:b/>
+                <w:color w:val="FFFFFF"/>
+                <w:sz w:val="22"/>
+              </w:rPr>
+              <w:t>Hoạt động chính</w:t>
+            </w:r>
+          </w:p>
+        </w:tc>
+      </w:tr>
+      <w:tr>
+        <w:tc>
+          <w:tcPr>
+            <w:tcW w:type="dxa" w:w="2160"/>
+            <w:shd w:fill="FFFFFF"/>
+          </w:tcPr>
+          <w:p>
+            <w:pPr>
+              <w:spacing w:before="40" w:after="40"/>
+            </w:pPr>
+            <w:r>
+              <w:rPr>
+                <w:rFonts w:ascii="Times New Roman" w:hAnsi="Times New Roman"/>
+                <w:color w:val="000000"/>
+                <w:sz w:val="22"/>
+              </w:rPr>
+              <w:t>Thứ 2</w:t>
+            </w:r>
+          </w:p>
+        </w:tc>
+        <w:tc>
+          <w:tcPr>
+            <w:tcW w:type="dxa" w:w="7200"/>
+            <w:shd w:fill="FFFFFF"/>
+          </w:tcPr>
+          <w:p>
+            <w:pPr>
+              <w:spacing w:before="40" w:after="40"/>
+            </w:pPr>
+            <w:r>
+              <w:rPr>
+                <w:rFonts w:ascii="Times New Roman" w:hAnsi="Times New Roman"/>
+                <w:color w:val="000000"/>
+                <w:sz w:val="22"/>
+              </w:rPr>
+              <w:t>Tổng hợp yêu cầu tồn đọng từ tuần trước, phân công xử lý ưu tiên</w:t>
+            </w:r>
+          </w:p>
+        </w:tc>
+      </w:tr>
+      <w:tr>
+        <w:tc>
+          <w:tcPr>
+            <w:tcW w:type="dxa" w:w="2160"/>
+            <w:shd w:fill="F5F5F5"/>
+          </w:tcPr>
+          <w:p>
+            <w:pPr>
+              <w:spacing w:before="40" w:after="40"/>
+            </w:pPr>
+            <w:r>
+              <w:rPr>
+                <w:rFonts w:ascii="Times New Roman" w:hAnsi="Times New Roman"/>
+                <w:color w:val="000000"/>
+                <w:sz w:val="22"/>
+              </w:rPr>
+              <w:t>Thứ 3 - 5</w:t>
+            </w:r>
+          </w:p>
+        </w:tc>
+        <w:tc>
+          <w:tcPr>
+            <w:tcW w:type="dxa" w:w="7200"/>
+            <w:shd w:fill="F5F5F5"/>
+          </w:tcPr>
+          <w:p>
+            <w:pPr>
+              <w:spacing w:before="40" w:after="40"/>
+            </w:pPr>
+            <w:r>
+              <w:rPr>
+                <w:rFonts w:ascii="Times New Roman" w:hAnsi="Times New Roman"/>
+                <w:color w:val="000000"/>
+                <w:sz w:val="22"/>
+              </w:rPr>
+              <w:t>Xử lý luồng chính: tiếp nhận, xác minh, thu hồi hàng, kiểm tra kho, đền bù</w:t>
+            </w:r>
+          </w:p>
+        </w:tc>
+      </w:tr>
+      <w:tr>
+        <w:tc>
+          <w:tcPr>
+            <w:tcW w:type="dxa" w:w="2160"/>
+            <w:shd w:fill="FFFFFF"/>
+          </w:tcPr>
+          <w:p>
+            <w:pPr>
+              <w:spacing w:before="40" w:after="40"/>
+            </w:pPr>
+            <w:r>
+              <w:rPr>
+                <w:rFonts w:ascii="Times New Roman" w:hAnsi="Times New Roman"/>
+                <w:color w:val="000000"/>
+                <w:sz w:val="22"/>
+              </w:rPr>
+              <w:t>Thứ 6</w:t>
+            </w:r>
+          </w:p>
+        </w:tc>
+        <w:tc>
+          <w:tcPr>
+            <w:tcW w:type="dxa" w:w="7200"/>
+            <w:shd w:fill="FFFFFF"/>
+          </w:tcPr>
+          <w:p>
+            <w:pPr>
+              <w:spacing w:before="40" w:after="40"/>
+            </w:pPr>
+            <w:r>
+              <w:rPr>
+                <w:rFonts w:ascii="Times New Roman" w:hAnsi="Times New Roman"/>
+                <w:color w:val="000000"/>
+                <w:sz w:val="22"/>
+              </w:rPr>
+              <w:t>Đối soát tổng hợp cuối tuần, rà soát SLA, báo cáo KPI quy trình</w:t>
+            </w:r>
+          </w:p>
+        </w:tc>
+      </w:tr>
+      <w:tr>
+        <w:tc>
+          <w:tcPr>
+            <w:tcW w:type="dxa" w:w="2160"/>
+            <w:shd w:fill="F5F5F5"/>
+          </w:tcPr>
+          <w:p>
+            <w:pPr>
+              <w:spacing w:before="40" w:after="40"/>
+            </w:pPr>
+            <w:r>
+              <w:rPr>
+                <w:rFonts w:ascii="Times New Roman" w:hAnsi="Times New Roman"/>
+                <w:color w:val="000000"/>
+                <w:sz w:val="22"/>
+              </w:rPr>
+              <w:t>Thứ 7</w:t>
+            </w:r>
+          </w:p>
+        </w:tc>
+        <w:tc>
+          <w:tcPr>
+            <w:tcW w:type="dxa" w:w="7200"/>
+            <w:shd w:fill="F5F5F5"/>
+          </w:tcPr>
+          <w:p>
+            <w:pPr>
+              <w:spacing w:before="40" w:after="40"/>
+            </w:pPr>
+            <w:r>
+              <w:rPr>
+                <w:rFonts w:ascii="Times New Roman" w:hAnsi="Times New Roman"/>
+                <w:color w:val="000000"/>
+                <w:sz w:val="22"/>
+              </w:rPr>
+              <w:t>Trực ca tối xử lý yêu cầu khẩn cấp, bảo trì hệ thống CNTT</w:t>
+            </w:r>
+          </w:p>
+        </w:tc>
+      </w:tr>
+    </w:tbl>
+    <w:p>
+      <w:pPr>
+        <w:spacing w:before="80" w:after="80"/>
+        <w:jc w:val="left"/>
+      </w:pPr>
+      <w:r>
+        <w:rPr>
+          <w:rFonts w:ascii="Times New Roman" w:hAnsi="Times New Roman"/>
+          <w:b/>
+          <w:i w:val="0"/>
+          <w:color w:val="000000"/>
+          <w:sz w:val="22"/>
+        </w:rPr>
+        <w:t>Kế hoạch công việc theo tuần:</w:t>
+      </w:r>
+    </w:p>
+    <w:tbl>
+      <w:tblPr>
+        <w:tblW w:type="auto" w:w="0"/>
+        <w:jc w:val="center"/>
+        <w:tblLook w:firstColumn="1" w:firstRow="1" w:lastColumn="0" w:lastRow="0" w:noHBand="0" w:noVBand="1" w:val="04A0"/>
+      </w:tblPr>
+      <w:tblGrid>
+        <w:gridCol w:w="3120"/>
+        <w:gridCol w:w="3120"/>
+        <w:gridCol w:w="3120"/>
+      </w:tblGrid>
+      <w:tr>
+        <w:tc>
+          <w:tcPr>
+            <w:tcW w:type="dxa" w:w="2160"/>
+            <w:shd w:fill="333333"/>
+          </w:tcPr>
+          <w:p>
+            <w:pPr>
+              <w:spacing w:before="60" w:after="60"/>
+              <w:jc w:val="center"/>
+            </w:pPr>
+            <w:r>
+              <w:rPr>
+                <w:rFonts w:ascii="Times New Roman" w:hAnsi="Times New Roman"/>
+                <w:b/>
+                <w:color w:val="FFFFFF"/>
+                <w:sz w:val="22"/>
+              </w:rPr>
+              <w:t>Ca làm việc</w:t>
+            </w:r>
+          </w:p>
+        </w:tc>
+        <w:tc>
+          <w:tcPr>
+            <w:tcW w:type="dxa" w:w="2160"/>
+            <w:shd w:fill="333333"/>
+          </w:tcPr>
+          <w:p>
+            <w:pPr>
+              <w:spacing w:before="60" w:after="60"/>
+              <w:jc w:val="center"/>
+            </w:pPr>
+            <w:r>
+              <w:rPr>
+                <w:rFonts w:ascii="Times New Roman" w:hAnsi="Times New Roman"/>
+                <w:b/>
+                <w:color w:val="FFFFFF"/>
+                <w:sz w:val="22"/>
+              </w:rPr>
+              <w:t>Khung giờ</w:t>
+            </w:r>
+          </w:p>
+        </w:tc>
+        <w:tc>
+          <w:tcPr>
+            <w:tcW w:type="dxa" w:w="5040"/>
+            <w:shd w:fill="333333"/>
+          </w:tcPr>
+          <w:p>
+            <w:pPr>
+              <w:spacing w:before="60" w:after="60"/>
+              <w:jc w:val="center"/>
+            </w:pPr>
+            <w:r>
+              <w:rPr>
+                <w:rFonts w:ascii="Times New Roman" w:hAnsi="Times New Roman"/>
+                <w:b/>
+                <w:color w:val="FFFFFF"/>
+                <w:sz w:val="22"/>
+              </w:rPr>
+              <w:t>Hoạt động chính</w:t>
+            </w:r>
+          </w:p>
+        </w:tc>
+      </w:tr>
+      <w:tr>
+        <w:tc>
+          <w:tcPr>
+            <w:tcW w:type="dxa" w:w="2160"/>
+            <w:shd w:fill="FFFFFF"/>
+          </w:tcPr>
+          <w:p>
+            <w:pPr>
+              <w:spacing w:before="40" w:after="40"/>
+            </w:pPr>
+            <w:r>
+              <w:rPr>
+                <w:rFonts w:ascii="Times New Roman" w:hAnsi="Times New Roman"/>
+                <w:color w:val="000000"/>
+                <w:sz w:val="22"/>
+              </w:rPr>
+              <w:t>Ca sáng</w:t>
+            </w:r>
+          </w:p>
+        </w:tc>
+        <w:tc>
+          <w:tcPr>
+            <w:tcW w:type="dxa" w:w="2160"/>
+            <w:shd w:fill="FFFFFF"/>
+          </w:tcPr>
+          <w:p>
+            <w:pPr>
+              <w:spacing w:before="40" w:after="40"/>
+            </w:pPr>
+            <w:r>
+              <w:rPr>
+                <w:rFonts w:ascii="Times New Roman" w:hAnsi="Times New Roman"/>
+                <w:color w:val="000000"/>
+                <w:sz w:val="22"/>
+              </w:rPr>
+              <w:t>08:00 - 12:00</w:t>
+            </w:r>
+          </w:p>
+        </w:tc>
+        <w:tc>
+          <w:tcPr>
+            <w:tcW w:type="dxa" w:w="5040"/>
+            <w:shd w:fill="FFFFFF"/>
+          </w:tcPr>
+          <w:p>
+            <w:pPr>
+              <w:spacing w:before="40" w:after="40"/>
+            </w:pPr>
+            <w:r>
+              <w:rPr>
+                <w:rFonts w:ascii="Times New Roman" w:hAnsi="Times New Roman"/>
+                <w:color w:val="000000"/>
+                <w:sz w:val="22"/>
+              </w:rPr>
+              <w:t>Tiếp nhận yêu cầu mới, kiểm tra thông tin, xác minh nguyên nhân sự cố với Kho/Shipper</w:t>
+            </w:r>
+          </w:p>
+        </w:tc>
+      </w:tr>
+      <w:tr>
+        <w:tc>
+          <w:tcPr>
+            <w:tcW w:type="dxa" w:w="2160"/>
+            <w:shd w:fill="F5F5F5"/>
+          </w:tcPr>
+          <w:p>
+            <w:pPr>
+              <w:spacing w:before="40" w:after="40"/>
+            </w:pPr>
+            <w:r>
+              <w:rPr>
+                <w:rFonts w:ascii="Times New Roman" w:hAnsi="Times New Roman"/>
+                <w:color w:val="000000"/>
+                <w:sz w:val="22"/>
+              </w:rPr>
+              <w:t>Ca chiều</w:t>
+            </w:r>
+          </w:p>
+        </w:tc>
+        <w:tc>
+          <w:tcPr>
+            <w:tcW w:type="dxa" w:w="2160"/>
+            <w:shd w:fill="F5F5F5"/>
+          </w:tcPr>
+          <w:p>
+            <w:pPr>
+              <w:spacing w:before="40" w:after="40"/>
+            </w:pPr>
+            <w:r>
+              <w:rPr>
+                <w:rFonts w:ascii="Times New Roman" w:hAnsi="Times New Roman"/>
+                <w:color w:val="000000"/>
+                <w:sz w:val="22"/>
+              </w:rPr>
+              <w:t>13:00 - 17:00</w:t>
+            </w:r>
+          </w:p>
+        </w:tc>
+        <w:tc>
+          <w:tcPr>
+            <w:tcW w:type="dxa" w:w="5040"/>
+            <w:shd w:fill="F5F5F5"/>
+          </w:tcPr>
+          <w:p>
+            <w:pPr>
+              <w:spacing w:before="40" w:after="40"/>
+            </w:pPr>
+            <w:r>
+              <w:rPr>
+                <w:rFonts w:ascii="Times New Roman" w:hAnsi="Times New Roman"/>
+                <w:color w:val="000000"/>
+                <w:sz w:val="22"/>
+              </w:rPr>
+              <w:t>Phân loại yêu cầu, điều phối Shipper thu hồi hàng, kiểm tra hàng hoàn tại kho</w:t>
+            </w:r>
+          </w:p>
+        </w:tc>
+      </w:tr>
+      <w:tr>
+        <w:tc>
+          <w:tcPr>
+            <w:tcW w:type="dxa" w:w="2160"/>
+            <w:shd w:fill="FFFFFF"/>
+          </w:tcPr>
+          <w:p>
+            <w:pPr>
+              <w:spacing w:before="40" w:after="40"/>
+            </w:pPr>
+            <w:r>
+              <w:rPr>
+                <w:rFonts w:ascii="Times New Roman" w:hAnsi="Times New Roman"/>
+                <w:color w:val="000000"/>
+                <w:sz w:val="22"/>
+              </w:rPr>
+              <w:t>Ca tối (trực)</w:t>
+            </w:r>
+          </w:p>
+        </w:tc>
+        <w:tc>
+          <w:tcPr>
+            <w:tcW w:type="dxa" w:w="2160"/>
+            <w:shd w:fill="FFFFFF"/>
+          </w:tcPr>
+          <w:p>
+            <w:pPr>
+              <w:spacing w:before="40" w:after="40"/>
+            </w:pPr>
+            <w:r>
+              <w:rPr>
+                <w:rFonts w:ascii="Times New Roman" w:hAnsi="Times New Roman"/>
+                <w:color w:val="000000"/>
+                <w:sz w:val="22"/>
+              </w:rPr>
+              <w:t>17:00 - 21:00</w:t>
+            </w:r>
+          </w:p>
+        </w:tc>
+        <w:tc>
+          <w:tcPr>
+            <w:tcW w:type="dxa" w:w="5040"/>
+            <w:shd w:fill="FFFFFF"/>
+          </w:tcPr>
+          <w:p>
+            <w:pPr>
+              <w:spacing w:before="40" w:after="40"/>
+            </w:pPr>
+            <w:r>
+              <w:rPr>
+                <w:rFonts w:ascii="Times New Roman" w:hAnsi="Times New Roman"/>
+                <w:color w:val="000000"/>
+                <w:sz w:val="22"/>
+              </w:rPr>
+              <w:t>Xử lý khiếu nại đền bù, gửi thông báo kết quả phản hồi, cập nhật hệ thống lưu trữ</w:t>
+            </w:r>
+          </w:p>
+        </w:tc>
+      </w:tr>
+    </w:tbl>
+    <w:p>
+      <w:pPr>
+        <w:spacing w:before="80" w:after="80"/>
+        <w:jc w:val="left"/>
+      </w:pPr>
+      <w:r>
+        <w:rPr>
+          <w:rFonts w:ascii="Times New Roman" w:hAnsi="Times New Roman"/>
+          <w:b/>
+          <w:i w:val="0"/>
+          <w:color w:val="000000"/>
+          <w:sz w:val="22"/>
+        </w:rPr>
+        <w:t>Kế hoạch công việc theo ca:</w:t>
+      </w:r>
+    </w:p>
+    <w:p>
+      <w:pPr>
+        <w:pStyle w:val="ListParagraph"/>
+        <w:spacing w:before="20" w:after="40"/>
+      </w:pPr>
+      <w:r>
+        <w:rPr>
+          <w:rFonts w:ascii="Times New Roman" w:hAnsi="Times New Roman"/>
+          <w:b/>
+          <w:color w:val="000000"/>
+          <w:sz w:val="22"/>
+        </w:rPr>
+        <w:t xml:space="preserve">• </w:t>
+      </w:r>
+      <w:r>
+        <w:rPr>
+          <w:rFonts w:ascii="Times New Roman" w:hAnsi="Times New Roman"/>
+          <w:b w:val="0"/>
+          <w:color w:val="000000"/>
+          <w:sz w:val="22"/>
+        </w:rPr>
+        <w:t>Tự động hóa khâu đối soát thông tin giữa CSKH và Kho qua tích hợp API.</w:t>
+      </w:r>
+    </w:p>
+    <w:p>
+      <w:pPr>
+        <w:pStyle w:val="ListParagraph"/>
+        <w:spacing w:before="20" w:after="40"/>
+      </w:pPr>
+      <w:r>
+        <w:rPr>
+          <w:rFonts w:ascii="Times New Roman" w:hAnsi="Times New Roman"/>
+          <w:b/>
+          <w:color w:val="000000"/>
+          <w:sz w:val="22"/>
+        </w:rPr>
+        <w:t xml:space="preserve">• </w:t>
+      </w:r>
+      <w:r>
+        <w:rPr>
+          <w:rFonts w:ascii="Times New Roman" w:hAnsi="Times New Roman"/>
+          <w:b w:val="0"/>
+          <w:color w:val="000000"/>
+          <w:sz w:val="22"/>
+        </w:rPr>
+        <w:t>Giảm thời gian hàng hoàn tồn đọng tại kho xuống dưới 24 giờ.</w:t>
+      </w:r>
+    </w:p>
+    <w:p>
+      <w:pPr>
+        <w:pStyle w:val="ListParagraph"/>
+        <w:spacing w:before="20" w:after="40"/>
+      </w:pPr>
+      <w:r>
+        <w:rPr>
+          <w:rFonts w:ascii="Times New Roman" w:hAnsi="Times New Roman"/>
+          <w:b/>
+          <w:color w:val="000000"/>
+          <w:sz w:val="22"/>
+        </w:rPr>
+        <w:t xml:space="preserve">• </w:t>
+      </w:r>
+      <w:r>
+        <w:rPr>
+          <w:rFonts w:ascii="Times New Roman" w:hAnsi="Times New Roman"/>
+          <w:b w:val="0"/>
+          <w:color w:val="000000"/>
+          <w:sz w:val="22"/>
+        </w:rPr>
+        <w:t>Tăng tỷ lệ thu hồi hàng hoàn thành công trong lần thu hồi đầu tiên lên trên 85%.</w:t>
+      </w:r>
+    </w:p>
+    <w:p>
+      <w:pPr>
+        <w:pStyle w:val="ListParagraph"/>
+        <w:spacing w:before="20" w:after="40"/>
+      </w:pPr>
+      <w:r>
+        <w:rPr>
+          <w:rFonts w:ascii="Times New Roman" w:hAnsi="Times New Roman"/>
+          <w:b/>
+          <w:color w:val="000000"/>
+          <w:sz w:val="22"/>
+        </w:rPr>
+        <w:t xml:space="preserve">• </w:t>
+      </w:r>
+      <w:r>
+        <w:rPr>
+          <w:rFonts w:ascii="Times New Roman" w:hAnsi="Times New Roman"/>
+          <w:b w:val="0"/>
+          <w:color w:val="000000"/>
+          <w:sz w:val="22"/>
+        </w:rPr>
+        <w:t>Giảm tỷ lệ hồ sơ phải bổ sung chứng từ (rework) từ 20% xuống dưới 10%.</w:t>
+      </w:r>
+    </w:p>
+    <w:p>
+      <w:pPr>
+        <w:pStyle w:val="ListParagraph"/>
+        <w:spacing w:before="20" w:after="40"/>
+      </w:pPr>
+      <w:r>
+        <w:rPr>
+          <w:rFonts w:ascii="Times New Roman" w:hAnsi="Times New Roman"/>
+          <w:b/>
+          <w:color w:val="000000"/>
+          <w:sz w:val="22"/>
+        </w:rPr>
+        <w:t xml:space="preserve">• </w:t>
+      </w:r>
+      <w:r>
+        <w:rPr>
+          <w:rFonts w:ascii="Times New Roman" w:hAnsi="Times New Roman"/>
+          <w:b w:val="0"/>
+          <w:color w:val="000000"/>
+          <w:sz w:val="22"/>
+        </w:rPr>
+        <w:t>Rút ngắn thời gian xử lý yêu cầu hoàn trả/khiếu nại từ tiếp nhận đến kết thúc xuống dưới 24 giờ làm việc.</w:t>
+      </w:r>
+    </w:p>
+    <w:p>
+      <w:pPr>
+        <w:spacing w:before="40" w:after="80"/>
+        <w:jc w:val="left"/>
+      </w:pPr>
+      <w:r>
+        <w:rPr>
+          <w:rFonts w:ascii="Times New Roman" w:hAnsi="Times New Roman"/>
+          <w:b/>
+          <w:i w:val="0"/>
+          <w:color w:val="000000"/>
+          <w:sz w:val="22"/>
+        </w:rPr>
+        <w:t>Mục tiêu kế hoạch:</w:t>
+      </w:r>
+    </w:p>
+    <w:p>
+      <w:pPr>
+        <w:spacing w:before="120" w:after="60"/>
+        <w:jc w:val="left"/>
+      </w:pPr>
+      <w:r>
+        <w:rPr>
+          <w:rFonts w:ascii="Times New Roman" w:hAnsi="Times New Roman"/>
+          <w:b/>
+          <w:i w:val="0"/>
+          <w:color w:val="000000"/>
+          <w:sz w:val="26"/>
+        </w:rPr>
+        <w:t>3.8.1.1.3. Kế hoạch làm việc</w:t>
+      </w:r>
+    </w:p>
     <w:p>
       <w:pPr>
         <w:spacing w:before="200" w:after="80"/>
@@ -429,16 +4477,9 @@
           <w:rFonts w:ascii="Times New Roman" w:hAnsi="Times New Roman"/>
           <w:b/>
           <w:color w:val="000000"/>
+          <w:sz w:val="22"/>
         </w:rPr>
-        <w:t xml:space="preserve">Giá trị mang lại: </w:t>
-      </w:r>
-      <w:r>
-        <w:rPr>
-          <w:rFonts w:ascii="Times New Roman" w:hAnsi="Times New Roman"/>
-          <w:bCs/>
-          <w:color w:val="000000"/>
-        </w:rPr>
-        <w:t>Tối ưu thời gian giải quyết khiếu nại, đảm bảo tính chính xác trong khâu thu hồi hàng hoàn, bảo vệ quyền lợi tài chính cho khách hàng và phòng ngừa gian lận cho doanh nghiệp.</w:t>
+        <w:t>Giá trị mang lại: Rút ngắn thời gian giải quyết khiếu nại, kiểm soát khâu thu hồi hàng hoàn, bảo vệ quyền lợi tài chính cho khách hàng và hạn chế gian lận cho doanh nghiệp.</w:t>
       </w:r>
     </w:p>
     <w:p>
@@ -2263,15 +6304,9 @@
           <w:rFonts w:ascii="Times New Roman" w:hAnsi="Times New Roman"/>
           <w:b/>
           <w:color w:val="000000"/>
+          <w:sz w:val="22"/>
         </w:rPr>
-        <w:t xml:space="preserve">• </w:t>
-      </w:r>
-      <w:r>
-        <w:rPr>
-          <w:rFonts w:ascii="Times New Roman" w:hAnsi="Times New Roman"/>
-          <w:color w:val="000000"/>
-        </w:rPr>
-        <w:t>Yêu cầu hoàn trả hoặc khiếu nại được tiếp nhận và xử lý nhanh chóng, minh bạch.</w:t>
+        <w:t>• Yêu cầu hoàn trả hoặc khiếu nại được tiếp nhận và xử lý đúng hạn, có thông báo rõ từng bước.</w:t>
       </w:r>
     </w:p>
     <w:p>
@@ -3281,8 +7316,9 @@
         <w:rPr>
           <w:rFonts w:ascii="Times New Roman" w:hAnsi="Times New Roman"/>
           <w:color w:val="000000"/>
+          <w:sz w:val="22"/>
         </w:rPr>
-        <w:t>Nhìn chung, nguyên nhân gốc rễ của phần lớn các vấn đề trên đều quy về việc thiếu dữ liệu và cơ chế phối hợp thời gian thực giữa các bộ phận: hệ thống CRM CSKH và WMS Kho chưa tích hợp API tự động, các quy trình phê duyệt biên bản vẫn phụ thuộc vào ký giấy thủ công thay vì sử dụng chữ ký số e-Signature trên ứng dụng di động.</w:t>
+        <w:t>Nguyên nhân gốc rễ của các vấn đề trên quy về: hệ thống CRM CSKH và WMS Kho chưa tích hợp API tự động nên thiếu dữ liệu phối hợp thời gian thực giữa các bộ phận; quy trình phê duyệt biên bản vẫn phụ thuộc ký giấy thủ công thay vì dùng chữ ký số e-Signature trên ứng dụng di động.</w:t>
       </w:r>
     </w:p>
     <w:p>
@@ -7860,6 +11896,48 @@
     <w:p>
       <w:pPr>
         <w:spacing w:after="80"/>
+      </w:pPr>
+    </w:p>
+    <w:p>
+      <w:pPr>
+        <w:spacing w:before="0" w:after="80"/>
+        <w:jc w:val="left"/>
+      </w:pPr>
+    </w:p>
+    <w:p>
+      <w:pPr>
+        <w:spacing w:before="0" w:after="80"/>
+        <w:jc w:val="left"/>
+      </w:pPr>
+    </w:p>
+    <w:p>
+      <w:pPr>
+        <w:spacing w:before="0" w:after="80"/>
+        <w:jc w:val="left"/>
+      </w:pPr>
+    </w:p>
+    <w:p>
+      <w:pPr>
+        <w:spacing w:before="0" w:after="80"/>
+        <w:jc w:val="left"/>
+      </w:pPr>
+    </w:p>
+    <w:p>
+      <w:pPr>
+        <w:spacing w:before="0" w:after="80"/>
+        <w:jc w:val="left"/>
+      </w:pPr>
+    </w:p>
+    <w:p>
+      <w:pPr>
+        <w:spacing w:before="0" w:after="80"/>
+        <w:jc w:val="left"/>
+      </w:pPr>
+    </w:p>
+    <w:p>
+      <w:pPr>
+        <w:spacing w:before="0" w:after="80"/>
+        <w:jc w:val="left"/>
       </w:pPr>
     </w:p>
     <w:sectPr>

</xml_diff>